<commit_message>
Polish final project deliverables
</commit_message>
<xml_diff>
--- a/report/finansal_ag_analizi_raporu_duzenlenmis.docx
+++ b/report/finansal_ag_analizi_raporu_duzenlenmis.docx
@@ -212,8 +212,16 @@
       </w:r>
     </w:p>
     <w:p>
+      <w:pPr>
+        <w:jc w:val="center"/>
+      </w:pPr>
       <w:r>
-        <w:t>Teslim Tarihi: 18 May?s 2026</w:t>
+        <w:rPr>
+          <w:rFonts w:ascii="Times New Roman" w:hAnsi="Times New Roman"/>
+          <w:b w:val="0"/>
+          <w:sz w:val="22"/>
+        </w:rPr>
+        <w:t>Teslim Tarihi: 18 Mayıs 2026</w:t>
       </w:r>
     </w:p>
     <w:p>
@@ -5083,34 +5091,46 @@
           </w:tcPr>
           <w:p>
             <w:pPr>
-              <w:spacing w:after="60"/>
               <w:jc w:val="center"/>
             </w:pPr>
             <w:r>
               <w:rPr>
                 <w:rFonts w:ascii="Times New Roman" w:hAnsi="Times New Roman"/>
+              </w:rPr>
+            </w:r>
+            <w:r>
+              <w:rPr>
+                <w:rFonts w:ascii="Times New Roman" w:hAnsi="Times New Roman"/>
                 <w:b/>
-                <w:sz w:val="18"/>
-              </w:rPr>
-              <w:t>?ekil 1 - Korelasyon Heatmap G?rseli</w:t>
-              <w:br/>
+                <w:sz w:val="20"/>
+              </w:rPr>
+              <w:t>Şekil 1 - Korelasyon Heatmap Görseli</w:t>
+            </w:r>
+          </w:p>
+          <w:p>
+            <w:pPr>
+              <w:jc w:val="center"/>
+            </w:pPr>
+            <w:r>
+              <w:rPr>
+                <w:rFonts w:ascii="Times New Roman" w:hAnsi="Times New Roman"/>
+                <w:sz w:val="18"/>
+              </w:rPr>
               <w:t>Dosya: outputs/heatmaps/correlation_heatmap.png</w:t>
             </w:r>
           </w:p>
           <w:p>
             <w:pPr>
-              <w:spacing w:after="60"/>
               <w:jc w:val="center"/>
             </w:pPr>
             <w:r>
               <w:rPr>
                 <w:rFonts w:ascii="Times New Roman" w:hAnsi="Times New Roman"/>
-                <w:sz w:val="18"/>
               </w:rPr>
               <w:drawing>
                 <wp:inline xmlns:a="http://schemas.openxmlformats.org/drawingml/2006/main" xmlns:pic="http://schemas.openxmlformats.org/drawingml/2006/picture">
-                  <wp:extent cx="5760720" cy="4320540"/>
-                  <wp:docPr id="1" name="Picture 1"/>
+                  <wp:extent cx="5852160" cy="5161098"/>
+                  <wp:docPr id="5" name="Picture 5"/>
                   <wp:cNvGraphicFramePr>
                     <a:graphicFrameLocks noChangeAspect="1"/>
                   </wp:cNvGraphicFramePr>
@@ -5122,7 +5142,7 @@
                           <pic:cNvPicPr/>
                         </pic:nvPicPr>
                         <pic:blipFill>
-                          <a:blip r:embed="rId11"/>
+                          <a:blip r:embed="rId15"/>
                           <a:stretch>
                             <a:fillRect/>
                           </a:stretch>
@@ -5130,7 +5150,7 @@
                         <pic:spPr>
                           <a:xfrm>
                             <a:off x="0" y="0"/>
-                            <a:ext cx="5760720" cy="4320540"/>
+                            <a:ext cx="5852160" cy="5161098"/>
                           </a:xfrm>
                           <a:prstGeom prst="rect"/>
                         </pic:spPr>
@@ -5620,11 +5640,27 @@
             </w:pPr>
             <w:r>
               <w:rPr>
+                <w:rFonts w:ascii="Times New Roman" w:hAnsi="Times New Roman"/>
+              </w:rPr>
+            </w:r>
+            <w:r>
+              <w:rPr>
+                <w:rFonts w:ascii="Times New Roman" w:hAnsi="Times New Roman"/>
                 <w:b/>
-                <w:sz w:val="18"/>
-              </w:rPr>
-              <w:t>?ekil 2 - Geli?tirilmi? Finansal A? G?rseli</w:t>
-              <w:br/>
+                <w:sz w:val="20"/>
+              </w:rPr>
+              <w:t>Şekil 2 - Geliştirilmiş Finansal Ağ Görseli</w:t>
+            </w:r>
+          </w:p>
+          <w:p>
+            <w:pPr>
+              <w:jc w:val="center"/>
+            </w:pPr>
+            <w:r>
+              <w:rPr>
+                <w:rFonts w:ascii="Times New Roman" w:hAnsi="Times New Roman"/>
+                <w:sz w:val="18"/>
+              </w:rPr>
               <w:t>Dosya: outputs/graphs/network_graph_enhanced.png</w:t>
             </w:r>
           </w:p>
@@ -5633,10 +5669,13 @@
               <w:jc w:val="center"/>
             </w:pPr>
             <w:r>
+              <w:rPr>
+                <w:rFonts w:ascii="Times New Roman" w:hAnsi="Times New Roman"/>
+              </w:rPr>
               <w:drawing>
                 <wp:inline xmlns:a="http://schemas.openxmlformats.org/drawingml/2006/main" xmlns:pic="http://schemas.openxmlformats.org/drawingml/2006/picture">
-                  <wp:extent cx="5760720" cy="4394842"/>
-                  <wp:docPr id="4" name="Picture 4"/>
+                  <wp:extent cx="5852160" cy="4326204"/>
+                  <wp:docPr id="6" name="Picture 6"/>
                   <wp:cNvGraphicFramePr>
                     <a:graphicFrameLocks noChangeAspect="1"/>
                   </wp:cNvGraphicFramePr>
@@ -5648,7 +5687,7 @@
                           <pic:cNvPicPr/>
                         </pic:nvPicPr>
                         <pic:blipFill>
-                          <a:blip r:embed="rId14"/>
+                          <a:blip r:embed="rId16"/>
                           <a:stretch>
                             <a:fillRect/>
                           </a:stretch>
@@ -5656,7 +5695,7 @@
                         <pic:spPr>
                           <a:xfrm>
                             <a:off x="0" y="0"/>
-                            <a:ext cx="5760720" cy="4394842"/>
+                            <a:ext cx="5852160" cy="4326204"/>
                           </a:xfrm>
                           <a:prstGeom prst="rect"/>
                         </pic:spPr>
@@ -6283,34 +6322,46 @@
           </w:tcPr>
           <w:p>
             <w:pPr>
-              <w:spacing w:after="60"/>
               <w:jc w:val="center"/>
             </w:pPr>
             <w:r>
               <w:rPr>
                 <w:rFonts w:ascii="Times New Roman" w:hAnsi="Times New Roman"/>
+              </w:rPr>
+            </w:r>
+            <w:r>
+              <w:rPr>
+                <w:rFonts w:ascii="Times New Roman" w:hAnsi="Times New Roman"/>
                 <w:b/>
-                <w:sz w:val="18"/>
-              </w:rPr>
-              <w:t>?ekil 3 - Top Degree Centrality Bar Chart</w:t>
-              <w:br/>
+                <w:sz w:val="20"/>
+              </w:rPr>
+              <w:t>Şekil 3 - Top Degree Centrality Bar Chart</w:t>
+            </w:r>
+          </w:p>
+          <w:p>
+            <w:pPr>
+              <w:jc w:val="center"/>
+            </w:pPr>
+            <w:r>
+              <w:rPr>
+                <w:rFonts w:ascii="Times New Roman" w:hAnsi="Times New Roman"/>
+                <w:sz w:val="18"/>
+              </w:rPr>
               <w:t>Dosya: outputs/graphs/top_degree_nodes.png</w:t>
             </w:r>
           </w:p>
           <w:p>
             <w:pPr>
-              <w:spacing w:after="60"/>
               <w:jc w:val="center"/>
             </w:pPr>
             <w:r>
               <w:rPr>
                 <w:rFonts w:ascii="Times New Roman" w:hAnsi="Times New Roman"/>
-                <w:sz w:val="18"/>
               </w:rPr>
               <w:drawing>
                 <wp:inline xmlns:a="http://schemas.openxmlformats.org/drawingml/2006/main" xmlns:pic="http://schemas.openxmlformats.org/drawingml/2006/picture">
-                  <wp:extent cx="5760720" cy="2880360"/>
-                  <wp:docPr id="2" name="Picture 2"/>
+                  <wp:extent cx="5303520" cy="2651760"/>
+                  <wp:docPr id="7" name="Picture 7"/>
                   <wp:cNvGraphicFramePr>
                     <a:graphicFrameLocks noChangeAspect="1"/>
                   </wp:cNvGraphicFramePr>
@@ -6318,7 +6369,7 @@
                     <a:graphicData uri="http://schemas.openxmlformats.org/drawingml/2006/picture">
                       <pic:pic>
                         <pic:nvPicPr>
-                          <pic:cNvPr id="0" name="top_degree_nodes.png"/>
+                          <pic:cNvPr id="0" name="image.png"/>
                           <pic:cNvPicPr/>
                         </pic:nvPicPr>
                         <pic:blipFill>
@@ -6330,7 +6381,7 @@
                         <pic:spPr>
                           <a:xfrm>
                             <a:off x="0" y="0"/>
-                            <a:ext cx="5760720" cy="2880360"/>
+                            <a:ext cx="5303520" cy="2651760"/>
                           </a:xfrm>
                           <a:prstGeom prst="rect"/>
                         </pic:spPr>
@@ -8077,6 +8128,1539 @@
         <w:t>Not: Yukarıdaki tablo, threshold sonrası en az bir güçlü bağlantıya sahip aktif ağ düğümlerine ilişkin sonuçları göstermektedir. Ana veri setinde 18 finansal varlık bulunmakla birlikte, Natural_Gas, Nikkei225, BIST100, Bitcoin ve US_10Y_Bond gibi bazı varlıklar 0.40 threshold değerinin üzerinde yeterli bağlantı oluşturmadıkları için aktif edge list tablosunda yer almamıştır. Bu durum, söz konusu varlıkların seçilen eşik değerine göre ağın güçlü ilişki çekirdeğinden daha bağımsız hareket ettiğini göstermektedir. İstenirse bu düğümler merkeziyet açısından 0 bağlantılı izole düğümler olarak da yorumlanabilir.</w:t>
       </w:r>
     </w:p>
+    <w:p>
+      <w:pPr>
+        <w:jc w:val="both"/>
+      </w:pPr>
+      <w:r>
+        <w:rPr>
+          <w:rFonts w:ascii="Times New Roman" w:hAnsi="Times New Roman"/>
+          <w:b w:val="0"/>
+          <w:sz w:val="22"/>
+        </w:rPr>
+        <w:t>Aşağıdaki tablolar, merkezilik ölçütlerine göre en yüksek değere sahip ilk 5 finansal varlığı ayrı ayrı göstermektedir. Bu ayrım, hangi varlığın daha fazla bağlantıya sahip olduğunu, hangisinin köprü rolüne yaklaştığını ve hangi varlıkların ağ içinde daha etkili konumlandığını daha net okumayı sağlar.</w:t>
+      </w:r>
+    </w:p>
+    <w:p>
+      <w:pPr>
+        <w:jc w:val="left"/>
+      </w:pPr>
+      <w:r>
+        <w:rPr>
+          <w:rFonts w:ascii="Times New Roman" w:hAnsi="Times New Roman"/>
+          <w:b/>
+          <w:sz w:val="22"/>
+        </w:rPr>
+        <w:t>Degree Centrality İlk 5 Düğüm</w:t>
+      </w:r>
+    </w:p>
+    <w:tbl>
+      <w:tblPr>
+        <w:tblStyle w:val="TabloKlavuzu"/>
+        <w:tblW w:type="auto" w:w="0"/>
+        <w:jc w:val="center"/>
+        <w:tblLook w:firstColumn="1" w:firstRow="1" w:lastColumn="0" w:lastRow="0" w:noHBand="0" w:noVBand="1" w:val="04A0"/>
+      </w:tblPr>
+      <w:tblGrid>
+        <w:gridCol w:w="3216"/>
+        <w:gridCol w:w="3216"/>
+        <w:gridCol w:w="3216"/>
+      </w:tblGrid>
+      <w:tr>
+        <w:tc>
+          <w:tcPr>
+            <w:tcW w:type="dxa" w:w="3216"/>
+            <w:vAlign w:val="center"/>
+          </w:tcPr>
+          <w:p>
+            <w:pPr>
+              <w:jc w:val="center"/>
+            </w:pPr>
+            <w:r>
+              <w:rPr>
+                <w:rFonts w:ascii="Times New Roman" w:hAnsi="Times New Roman"/>
+                <w:b w:val="0"/>
+                <w:sz w:val="18"/>
+              </w:rPr>
+              <w:t>Sıra</w:t>
+            </w:r>
+          </w:p>
+        </w:tc>
+        <w:tc>
+          <w:tcPr>
+            <w:tcW w:type="dxa" w:w="3216"/>
+            <w:vAlign w:val="center"/>
+          </w:tcPr>
+          <w:p>
+            <w:pPr>
+              <w:jc w:val="center"/>
+            </w:pPr>
+            <w:r>
+              <w:rPr>
+                <w:rFonts w:ascii="Times New Roman" w:hAnsi="Times New Roman"/>
+                <w:b w:val="0"/>
+                <w:sz w:val="18"/>
+              </w:rPr>
+              <w:t>Düğüm</w:t>
+            </w:r>
+          </w:p>
+        </w:tc>
+        <w:tc>
+          <w:tcPr>
+            <w:tcW w:type="dxa" w:w="3216"/>
+            <w:vAlign w:val="center"/>
+          </w:tcPr>
+          <w:p>
+            <w:pPr>
+              <w:jc w:val="center"/>
+            </w:pPr>
+            <w:r>
+              <w:rPr>
+                <w:rFonts w:ascii="Times New Roman" w:hAnsi="Times New Roman"/>
+                <w:b w:val="0"/>
+                <w:sz w:val="18"/>
+              </w:rPr>
+              <w:t>Değer</w:t>
+            </w:r>
+          </w:p>
+        </w:tc>
+      </w:tr>
+      <w:tr>
+        <w:tc>
+          <w:tcPr>
+            <w:tcW w:type="dxa" w:w="3216"/>
+            <w:vAlign w:val="center"/>
+          </w:tcPr>
+          <w:p>
+            <w:pPr>
+              <w:jc w:val="center"/>
+            </w:pPr>
+            <w:r>
+              <w:rPr>
+                <w:rFonts w:ascii="Times New Roman" w:hAnsi="Times New Roman"/>
+                <w:b w:val="0"/>
+                <w:sz w:val="18"/>
+              </w:rPr>
+              <w:t>1</w:t>
+            </w:r>
+          </w:p>
+        </w:tc>
+        <w:tc>
+          <w:tcPr>
+            <w:tcW w:type="dxa" w:w="3216"/>
+            <w:vAlign w:val="center"/>
+          </w:tcPr>
+          <w:p>
+            <w:pPr>
+              <w:jc w:val="center"/>
+            </w:pPr>
+            <w:r>
+              <w:rPr>
+                <w:rFonts w:ascii="Times New Roman" w:hAnsi="Times New Roman"/>
+                <w:b w:val="0"/>
+                <w:sz w:val="18"/>
+              </w:rPr>
+              <w:t>DAX</w:t>
+            </w:r>
+          </w:p>
+        </w:tc>
+        <w:tc>
+          <w:tcPr>
+            <w:tcW w:type="dxa" w:w="3216"/>
+            <w:vAlign w:val="center"/>
+          </w:tcPr>
+          <w:p>
+            <w:pPr>
+              <w:jc w:val="center"/>
+            </w:pPr>
+            <w:r>
+              <w:rPr>
+                <w:rFonts w:ascii="Times New Roman" w:hAnsi="Times New Roman"/>
+                <w:b w:val="0"/>
+                <w:sz w:val="18"/>
+              </w:rPr>
+              <w:t>0.2941</w:t>
+            </w:r>
+          </w:p>
+        </w:tc>
+      </w:tr>
+      <w:tr>
+        <w:tc>
+          <w:tcPr>
+            <w:tcW w:type="dxa" w:w="3216"/>
+            <w:vAlign w:val="center"/>
+          </w:tcPr>
+          <w:p>
+            <w:pPr>
+              <w:jc w:val="center"/>
+            </w:pPr>
+            <w:r>
+              <w:rPr>
+                <w:rFonts w:ascii="Times New Roman" w:hAnsi="Times New Roman"/>
+                <w:b w:val="0"/>
+                <w:sz w:val="18"/>
+              </w:rPr>
+              <w:t>2</w:t>
+            </w:r>
+          </w:p>
+        </w:tc>
+        <w:tc>
+          <w:tcPr>
+            <w:tcW w:type="dxa" w:w="3216"/>
+            <w:vAlign w:val="center"/>
+          </w:tcPr>
+          <w:p>
+            <w:pPr>
+              <w:jc w:val="center"/>
+            </w:pPr>
+            <w:r>
+              <w:rPr>
+                <w:rFonts w:ascii="Times New Roman" w:hAnsi="Times New Roman"/>
+                <w:b w:val="0"/>
+                <w:sz w:val="18"/>
+              </w:rPr>
+              <w:t>SP500</w:t>
+            </w:r>
+          </w:p>
+        </w:tc>
+        <w:tc>
+          <w:tcPr>
+            <w:tcW w:type="dxa" w:w="3216"/>
+            <w:vAlign w:val="center"/>
+          </w:tcPr>
+          <w:p>
+            <w:pPr>
+              <w:jc w:val="center"/>
+            </w:pPr>
+            <w:r>
+              <w:rPr>
+                <w:rFonts w:ascii="Times New Roman" w:hAnsi="Times New Roman"/>
+                <w:b w:val="0"/>
+                <w:sz w:val="18"/>
+              </w:rPr>
+              <w:t>0.2941</w:t>
+            </w:r>
+          </w:p>
+        </w:tc>
+      </w:tr>
+      <w:tr>
+        <w:tc>
+          <w:tcPr>
+            <w:tcW w:type="dxa" w:w="3216"/>
+            <w:vAlign w:val="center"/>
+          </w:tcPr>
+          <w:p>
+            <w:pPr>
+              <w:jc w:val="center"/>
+            </w:pPr>
+            <w:r>
+              <w:rPr>
+                <w:rFonts w:ascii="Times New Roman" w:hAnsi="Times New Roman"/>
+                <w:b w:val="0"/>
+                <w:sz w:val="18"/>
+              </w:rPr>
+              <w:t>3</w:t>
+            </w:r>
+          </w:p>
+        </w:tc>
+        <w:tc>
+          <w:tcPr>
+            <w:tcW w:type="dxa" w:w="3216"/>
+            <w:vAlign w:val="center"/>
+          </w:tcPr>
+          <w:p>
+            <w:pPr>
+              <w:jc w:val="center"/>
+            </w:pPr>
+            <w:r>
+              <w:rPr>
+                <w:rFonts w:ascii="Times New Roman" w:hAnsi="Times New Roman"/>
+                <w:b w:val="0"/>
+                <w:sz w:val="18"/>
+              </w:rPr>
+              <w:t>FTSE100</w:t>
+            </w:r>
+          </w:p>
+        </w:tc>
+        <w:tc>
+          <w:tcPr>
+            <w:tcW w:type="dxa" w:w="3216"/>
+            <w:vAlign w:val="center"/>
+          </w:tcPr>
+          <w:p>
+            <w:pPr>
+              <w:jc w:val="center"/>
+            </w:pPr>
+            <w:r>
+              <w:rPr>
+                <w:rFonts w:ascii="Times New Roman" w:hAnsi="Times New Roman"/>
+                <w:b w:val="0"/>
+                <w:sz w:val="18"/>
+              </w:rPr>
+              <w:t>0.2941</w:t>
+            </w:r>
+          </w:p>
+        </w:tc>
+      </w:tr>
+      <w:tr>
+        <w:tc>
+          <w:tcPr>
+            <w:tcW w:type="dxa" w:w="3216"/>
+            <w:vAlign w:val="center"/>
+          </w:tcPr>
+          <w:p>
+            <w:pPr>
+              <w:jc w:val="center"/>
+            </w:pPr>
+            <w:r>
+              <w:rPr>
+                <w:rFonts w:ascii="Times New Roman" w:hAnsi="Times New Roman"/>
+                <w:b w:val="0"/>
+                <w:sz w:val="18"/>
+              </w:rPr>
+              <w:t>4</w:t>
+            </w:r>
+          </w:p>
+        </w:tc>
+        <w:tc>
+          <w:tcPr>
+            <w:tcW w:type="dxa" w:w="3216"/>
+            <w:vAlign w:val="center"/>
+          </w:tcPr>
+          <w:p>
+            <w:pPr>
+              <w:jc w:val="center"/>
+            </w:pPr>
+            <w:r>
+              <w:rPr>
+                <w:rFonts w:ascii="Times New Roman" w:hAnsi="Times New Roman"/>
+                <w:b w:val="0"/>
+                <w:sz w:val="18"/>
+              </w:rPr>
+              <w:t>VIX</w:t>
+            </w:r>
+          </w:p>
+        </w:tc>
+        <w:tc>
+          <w:tcPr>
+            <w:tcW w:type="dxa" w:w="3216"/>
+            <w:vAlign w:val="center"/>
+          </w:tcPr>
+          <w:p>
+            <w:pPr>
+              <w:jc w:val="center"/>
+            </w:pPr>
+            <w:r>
+              <w:rPr>
+                <w:rFonts w:ascii="Times New Roman" w:hAnsi="Times New Roman"/>
+                <w:b w:val="0"/>
+                <w:sz w:val="18"/>
+              </w:rPr>
+              <w:t>0.2941</w:t>
+            </w:r>
+          </w:p>
+        </w:tc>
+      </w:tr>
+      <w:tr>
+        <w:tc>
+          <w:tcPr>
+            <w:tcW w:type="dxa" w:w="3216"/>
+            <w:vAlign w:val="center"/>
+          </w:tcPr>
+          <w:p>
+            <w:pPr>
+              <w:jc w:val="center"/>
+            </w:pPr>
+            <w:r>
+              <w:rPr>
+                <w:rFonts w:ascii="Times New Roman" w:hAnsi="Times New Roman"/>
+                <w:b w:val="0"/>
+                <w:sz w:val="18"/>
+              </w:rPr>
+              <w:t>5</w:t>
+            </w:r>
+          </w:p>
+        </w:tc>
+        <w:tc>
+          <w:tcPr>
+            <w:tcW w:type="dxa" w:w="3216"/>
+            <w:vAlign w:val="center"/>
+          </w:tcPr>
+          <w:p>
+            <w:pPr>
+              <w:jc w:val="center"/>
+            </w:pPr>
+            <w:r>
+              <w:rPr>
+                <w:rFonts w:ascii="Times New Roman" w:hAnsi="Times New Roman"/>
+                <w:b w:val="0"/>
+                <w:sz w:val="18"/>
+              </w:rPr>
+              <w:t>Dow_Jones</w:t>
+            </w:r>
+          </w:p>
+        </w:tc>
+        <w:tc>
+          <w:tcPr>
+            <w:tcW w:type="dxa" w:w="3216"/>
+            <w:vAlign w:val="center"/>
+          </w:tcPr>
+          <w:p>
+            <w:pPr>
+              <w:jc w:val="center"/>
+            </w:pPr>
+            <w:r>
+              <w:rPr>
+                <w:rFonts w:ascii="Times New Roman" w:hAnsi="Times New Roman"/>
+                <w:b w:val="0"/>
+                <w:sz w:val="18"/>
+              </w:rPr>
+              <w:t>0.2941</w:t>
+            </w:r>
+          </w:p>
+        </w:tc>
+      </w:tr>
+    </w:tbl>
+    <w:p>
+      <w:pPr>
+        <w:jc w:val="left"/>
+      </w:pPr>
+      <w:r>
+        <w:rPr>
+          <w:rFonts w:ascii="Times New Roman" w:hAnsi="Times New Roman"/>
+          <w:b/>
+          <w:sz w:val="22"/>
+        </w:rPr>
+        <w:t>Betweenness Centrality İlk 5 Düğüm</w:t>
+      </w:r>
+    </w:p>
+    <w:tbl>
+      <w:tblPr>
+        <w:tblStyle w:val="TabloKlavuzu"/>
+        <w:tblW w:type="auto" w:w="0"/>
+        <w:jc w:val="center"/>
+        <w:tblLook w:firstColumn="1" w:firstRow="1" w:lastColumn="0" w:lastRow="0" w:noHBand="0" w:noVBand="1" w:val="04A0"/>
+      </w:tblPr>
+      <w:tblGrid>
+        <w:gridCol w:w="3216"/>
+        <w:gridCol w:w="3216"/>
+        <w:gridCol w:w="3216"/>
+      </w:tblGrid>
+      <w:tr>
+        <w:tc>
+          <w:tcPr>
+            <w:tcW w:type="dxa" w:w="3216"/>
+            <w:vAlign w:val="center"/>
+          </w:tcPr>
+          <w:p>
+            <w:pPr>
+              <w:jc w:val="center"/>
+            </w:pPr>
+            <w:r>
+              <w:rPr>
+                <w:rFonts w:ascii="Times New Roman" w:hAnsi="Times New Roman"/>
+                <w:b w:val="0"/>
+                <w:sz w:val="18"/>
+              </w:rPr>
+              <w:t>Sıra</w:t>
+            </w:r>
+          </w:p>
+        </w:tc>
+        <w:tc>
+          <w:tcPr>
+            <w:tcW w:type="dxa" w:w="3216"/>
+            <w:vAlign w:val="center"/>
+          </w:tcPr>
+          <w:p>
+            <w:pPr>
+              <w:jc w:val="center"/>
+            </w:pPr>
+            <w:r>
+              <w:rPr>
+                <w:rFonts w:ascii="Times New Roman" w:hAnsi="Times New Roman"/>
+                <w:b w:val="0"/>
+                <w:sz w:val="18"/>
+              </w:rPr>
+              <w:t>Düğüm</w:t>
+            </w:r>
+          </w:p>
+        </w:tc>
+        <w:tc>
+          <w:tcPr>
+            <w:tcW w:type="dxa" w:w="3216"/>
+            <w:vAlign w:val="center"/>
+          </w:tcPr>
+          <w:p>
+            <w:pPr>
+              <w:jc w:val="center"/>
+            </w:pPr>
+            <w:r>
+              <w:rPr>
+                <w:rFonts w:ascii="Times New Roman" w:hAnsi="Times New Roman"/>
+                <w:b w:val="0"/>
+                <w:sz w:val="18"/>
+              </w:rPr>
+              <w:t>Değer</w:t>
+            </w:r>
+          </w:p>
+        </w:tc>
+      </w:tr>
+      <w:tr>
+        <w:tc>
+          <w:tcPr>
+            <w:tcW w:type="dxa" w:w="3216"/>
+            <w:vAlign w:val="center"/>
+          </w:tcPr>
+          <w:p>
+            <w:pPr>
+              <w:jc w:val="center"/>
+            </w:pPr>
+            <w:r>
+              <w:rPr>
+                <w:rFonts w:ascii="Times New Roman" w:hAnsi="Times New Roman"/>
+                <w:b w:val="0"/>
+                <w:sz w:val="18"/>
+              </w:rPr>
+              <w:t>1</w:t>
+            </w:r>
+          </w:p>
+        </w:tc>
+        <w:tc>
+          <w:tcPr>
+            <w:tcW w:type="dxa" w:w="3216"/>
+            <w:vAlign w:val="center"/>
+          </w:tcPr>
+          <w:p>
+            <w:pPr>
+              <w:jc w:val="center"/>
+            </w:pPr>
+            <w:r>
+              <w:rPr>
+                <w:rFonts w:ascii="Times New Roman" w:hAnsi="Times New Roman"/>
+                <w:b w:val="0"/>
+                <w:sz w:val="18"/>
+              </w:rPr>
+              <w:t>VIX</w:t>
+            </w:r>
+          </w:p>
+        </w:tc>
+        <w:tc>
+          <w:tcPr>
+            <w:tcW w:type="dxa" w:w="3216"/>
+            <w:vAlign w:val="center"/>
+          </w:tcPr>
+          <w:p>
+            <w:pPr>
+              <w:jc w:val="center"/>
+            </w:pPr>
+            <w:r>
+              <w:rPr>
+                <w:rFonts w:ascii="Times New Roman" w:hAnsi="Times New Roman"/>
+                <w:b w:val="0"/>
+                <w:sz w:val="18"/>
+              </w:rPr>
+              <w:t>0.0735</w:t>
+            </w:r>
+          </w:p>
+        </w:tc>
+      </w:tr>
+      <w:tr>
+        <w:tc>
+          <w:tcPr>
+            <w:tcW w:type="dxa" w:w="3216"/>
+            <w:vAlign w:val="center"/>
+          </w:tcPr>
+          <w:p>
+            <w:pPr>
+              <w:jc w:val="center"/>
+            </w:pPr>
+            <w:r>
+              <w:rPr>
+                <w:rFonts w:ascii="Times New Roman" w:hAnsi="Times New Roman"/>
+                <w:b w:val="0"/>
+                <w:sz w:val="18"/>
+              </w:rPr>
+              <w:t>2</w:t>
+            </w:r>
+          </w:p>
+        </w:tc>
+        <w:tc>
+          <w:tcPr>
+            <w:tcW w:type="dxa" w:w="3216"/>
+            <w:vAlign w:val="center"/>
+          </w:tcPr>
+          <w:p>
+            <w:pPr>
+              <w:jc w:val="center"/>
+            </w:pPr>
+            <w:r>
+              <w:rPr>
+                <w:rFonts w:ascii="Times New Roman" w:hAnsi="Times New Roman"/>
+                <w:b w:val="0"/>
+                <w:sz w:val="18"/>
+              </w:rPr>
+              <w:t>Gold</w:t>
+            </w:r>
+          </w:p>
+        </w:tc>
+        <w:tc>
+          <w:tcPr>
+            <w:tcW w:type="dxa" w:w="3216"/>
+            <w:vAlign w:val="center"/>
+          </w:tcPr>
+          <w:p>
+            <w:pPr>
+              <w:jc w:val="center"/>
+            </w:pPr>
+            <w:r>
+              <w:rPr>
+                <w:rFonts w:ascii="Times New Roman" w:hAnsi="Times New Roman"/>
+                <w:b w:val="0"/>
+                <w:sz w:val="18"/>
+              </w:rPr>
+              <w:t>0.0074</w:t>
+            </w:r>
+          </w:p>
+        </w:tc>
+      </w:tr>
+      <w:tr>
+        <w:tc>
+          <w:tcPr>
+            <w:tcW w:type="dxa" w:w="3216"/>
+            <w:vAlign w:val="center"/>
+          </w:tcPr>
+          <w:p>
+            <w:pPr>
+              <w:jc w:val="center"/>
+            </w:pPr>
+            <w:r>
+              <w:rPr>
+                <w:rFonts w:ascii="Times New Roman" w:hAnsi="Times New Roman"/>
+                <w:b w:val="0"/>
+                <w:sz w:val="18"/>
+              </w:rPr>
+              <w:t>3</w:t>
+            </w:r>
+          </w:p>
+        </w:tc>
+        <w:tc>
+          <w:tcPr>
+            <w:tcW w:type="dxa" w:w="3216"/>
+            <w:vAlign w:val="center"/>
+          </w:tcPr>
+          <w:p>
+            <w:pPr>
+              <w:jc w:val="center"/>
+            </w:pPr>
+            <w:r>
+              <w:rPr>
+                <w:rFonts w:ascii="Times New Roman" w:hAnsi="Times New Roman"/>
+                <w:b w:val="0"/>
+                <w:sz w:val="18"/>
+              </w:rPr>
+              <w:t>Silver</w:t>
+            </w:r>
+          </w:p>
+        </w:tc>
+        <w:tc>
+          <w:tcPr>
+            <w:tcW w:type="dxa" w:w="3216"/>
+            <w:vAlign w:val="center"/>
+          </w:tcPr>
+          <w:p>
+            <w:pPr>
+              <w:jc w:val="center"/>
+            </w:pPr>
+            <w:r>
+              <w:rPr>
+                <w:rFonts w:ascii="Times New Roman" w:hAnsi="Times New Roman"/>
+                <w:b w:val="0"/>
+                <w:sz w:val="18"/>
+              </w:rPr>
+              <w:t>0.0000</w:t>
+            </w:r>
+          </w:p>
+        </w:tc>
+      </w:tr>
+      <w:tr>
+        <w:tc>
+          <w:tcPr>
+            <w:tcW w:type="dxa" w:w="3216"/>
+            <w:vAlign w:val="center"/>
+          </w:tcPr>
+          <w:p>
+            <w:pPr>
+              <w:jc w:val="center"/>
+            </w:pPr>
+            <w:r>
+              <w:rPr>
+                <w:rFonts w:ascii="Times New Roman" w:hAnsi="Times New Roman"/>
+                <w:b w:val="0"/>
+                <w:sz w:val="18"/>
+              </w:rPr>
+              <w:t>4</w:t>
+            </w:r>
+          </w:p>
+        </w:tc>
+        <w:tc>
+          <w:tcPr>
+            <w:tcW w:type="dxa" w:w="3216"/>
+            <w:vAlign w:val="center"/>
+          </w:tcPr>
+          <w:p>
+            <w:pPr>
+              <w:jc w:val="center"/>
+            </w:pPr>
+            <w:r>
+              <w:rPr>
+                <w:rFonts w:ascii="Times New Roman" w:hAnsi="Times New Roman"/>
+                <w:b w:val="0"/>
+                <w:sz w:val="18"/>
+              </w:rPr>
+              <w:t>Brent_Oil</w:t>
+            </w:r>
+          </w:p>
+        </w:tc>
+        <w:tc>
+          <w:tcPr>
+            <w:tcW w:type="dxa" w:w="3216"/>
+            <w:vAlign w:val="center"/>
+          </w:tcPr>
+          <w:p>
+            <w:pPr>
+              <w:jc w:val="center"/>
+            </w:pPr>
+            <w:r>
+              <w:rPr>
+                <w:rFonts w:ascii="Times New Roman" w:hAnsi="Times New Roman"/>
+                <w:b w:val="0"/>
+                <w:sz w:val="18"/>
+              </w:rPr>
+              <w:t>0.0000</w:t>
+            </w:r>
+          </w:p>
+        </w:tc>
+      </w:tr>
+      <w:tr>
+        <w:tc>
+          <w:tcPr>
+            <w:tcW w:type="dxa" w:w="3216"/>
+            <w:vAlign w:val="center"/>
+          </w:tcPr>
+          <w:p>
+            <w:pPr>
+              <w:jc w:val="center"/>
+            </w:pPr>
+            <w:r>
+              <w:rPr>
+                <w:rFonts w:ascii="Times New Roman" w:hAnsi="Times New Roman"/>
+                <w:b w:val="0"/>
+                <w:sz w:val="18"/>
+              </w:rPr>
+              <w:t>5</w:t>
+            </w:r>
+          </w:p>
+        </w:tc>
+        <w:tc>
+          <w:tcPr>
+            <w:tcW w:type="dxa" w:w="3216"/>
+            <w:vAlign w:val="center"/>
+          </w:tcPr>
+          <w:p>
+            <w:pPr>
+              <w:jc w:val="center"/>
+            </w:pPr>
+            <w:r>
+              <w:rPr>
+                <w:rFonts w:ascii="Times New Roman" w:hAnsi="Times New Roman"/>
+                <w:b w:val="0"/>
+                <w:sz w:val="18"/>
+              </w:rPr>
+              <w:t>Natural_Gas</w:t>
+            </w:r>
+          </w:p>
+        </w:tc>
+        <w:tc>
+          <w:tcPr>
+            <w:tcW w:type="dxa" w:w="3216"/>
+            <w:vAlign w:val="center"/>
+          </w:tcPr>
+          <w:p>
+            <w:pPr>
+              <w:jc w:val="center"/>
+            </w:pPr>
+            <w:r>
+              <w:rPr>
+                <w:rFonts w:ascii="Times New Roman" w:hAnsi="Times New Roman"/>
+                <w:b w:val="0"/>
+                <w:sz w:val="18"/>
+              </w:rPr>
+              <w:t>0.0000</w:t>
+            </w:r>
+          </w:p>
+        </w:tc>
+      </w:tr>
+    </w:tbl>
+    <w:p>
+      <w:pPr>
+        <w:jc w:val="left"/>
+      </w:pPr>
+      <w:r>
+        <w:rPr>
+          <w:rFonts w:ascii="Times New Roman" w:hAnsi="Times New Roman"/>
+          <w:b/>
+          <w:sz w:val="22"/>
+        </w:rPr>
+        <w:t>Closeness Centrality İlk 5 Düğüm</w:t>
+      </w:r>
+    </w:p>
+    <w:tbl>
+      <w:tblPr>
+        <w:tblStyle w:val="TabloKlavuzu"/>
+        <w:tblW w:type="auto" w:w="0"/>
+        <w:jc w:val="center"/>
+        <w:tblLook w:firstColumn="1" w:firstRow="1" w:lastColumn="0" w:lastRow="0" w:noHBand="0" w:noVBand="1" w:val="04A0"/>
+      </w:tblPr>
+      <w:tblGrid>
+        <w:gridCol w:w="3216"/>
+        <w:gridCol w:w="3216"/>
+        <w:gridCol w:w="3216"/>
+      </w:tblGrid>
+      <w:tr>
+        <w:tc>
+          <w:tcPr>
+            <w:tcW w:type="dxa" w:w="3216"/>
+            <w:vAlign w:val="center"/>
+          </w:tcPr>
+          <w:p>
+            <w:pPr>
+              <w:jc w:val="center"/>
+            </w:pPr>
+            <w:r>
+              <w:rPr>
+                <w:rFonts w:ascii="Times New Roman" w:hAnsi="Times New Roman"/>
+                <w:b w:val="0"/>
+                <w:sz w:val="18"/>
+              </w:rPr>
+              <w:t>Sıra</w:t>
+            </w:r>
+          </w:p>
+        </w:tc>
+        <w:tc>
+          <w:tcPr>
+            <w:tcW w:type="dxa" w:w="3216"/>
+            <w:vAlign w:val="center"/>
+          </w:tcPr>
+          <w:p>
+            <w:pPr>
+              <w:jc w:val="center"/>
+            </w:pPr>
+            <w:r>
+              <w:rPr>
+                <w:rFonts w:ascii="Times New Roman" w:hAnsi="Times New Roman"/>
+                <w:b w:val="0"/>
+                <w:sz w:val="18"/>
+              </w:rPr>
+              <w:t>Düğüm</w:t>
+            </w:r>
+          </w:p>
+        </w:tc>
+        <w:tc>
+          <w:tcPr>
+            <w:tcW w:type="dxa" w:w="3216"/>
+            <w:vAlign w:val="center"/>
+          </w:tcPr>
+          <w:p>
+            <w:pPr>
+              <w:jc w:val="center"/>
+            </w:pPr>
+            <w:r>
+              <w:rPr>
+                <w:rFonts w:ascii="Times New Roman" w:hAnsi="Times New Roman"/>
+                <w:b w:val="0"/>
+                <w:sz w:val="18"/>
+              </w:rPr>
+              <w:t>Değer</w:t>
+            </w:r>
+          </w:p>
+        </w:tc>
+      </w:tr>
+      <w:tr>
+        <w:tc>
+          <w:tcPr>
+            <w:tcW w:type="dxa" w:w="3216"/>
+            <w:vAlign w:val="center"/>
+          </w:tcPr>
+          <w:p>
+            <w:pPr>
+              <w:jc w:val="center"/>
+            </w:pPr>
+            <w:r>
+              <w:rPr>
+                <w:rFonts w:ascii="Times New Roman" w:hAnsi="Times New Roman"/>
+                <w:b w:val="0"/>
+                <w:sz w:val="18"/>
+              </w:rPr>
+              <w:t>1</w:t>
+            </w:r>
+          </w:p>
+        </w:tc>
+        <w:tc>
+          <w:tcPr>
+            <w:tcW w:type="dxa" w:w="3216"/>
+            <w:vAlign w:val="center"/>
+          </w:tcPr>
+          <w:p>
+            <w:pPr>
+              <w:jc w:val="center"/>
+            </w:pPr>
+            <w:r>
+              <w:rPr>
+                <w:rFonts w:ascii="Times New Roman" w:hAnsi="Times New Roman"/>
+                <w:b w:val="0"/>
+                <w:sz w:val="18"/>
+              </w:rPr>
+              <w:t>DAX</w:t>
+            </w:r>
+          </w:p>
+        </w:tc>
+        <w:tc>
+          <w:tcPr>
+            <w:tcW w:type="dxa" w:w="3216"/>
+            <w:vAlign w:val="center"/>
+          </w:tcPr>
+          <w:p>
+            <w:pPr>
+              <w:jc w:val="center"/>
+            </w:pPr>
+            <w:r>
+              <w:rPr>
+                <w:rFonts w:ascii="Times New Roman" w:hAnsi="Times New Roman"/>
+                <w:b w:val="0"/>
+                <w:sz w:val="18"/>
+              </w:rPr>
+              <w:t>0.2941</w:t>
+            </w:r>
+          </w:p>
+        </w:tc>
+      </w:tr>
+      <w:tr>
+        <w:tc>
+          <w:tcPr>
+            <w:tcW w:type="dxa" w:w="3216"/>
+            <w:vAlign w:val="center"/>
+          </w:tcPr>
+          <w:p>
+            <w:pPr>
+              <w:jc w:val="center"/>
+            </w:pPr>
+            <w:r>
+              <w:rPr>
+                <w:rFonts w:ascii="Times New Roman" w:hAnsi="Times New Roman"/>
+                <w:b w:val="0"/>
+                <w:sz w:val="18"/>
+              </w:rPr>
+              <w:t>2</w:t>
+            </w:r>
+          </w:p>
+        </w:tc>
+        <w:tc>
+          <w:tcPr>
+            <w:tcW w:type="dxa" w:w="3216"/>
+            <w:vAlign w:val="center"/>
+          </w:tcPr>
+          <w:p>
+            <w:pPr>
+              <w:jc w:val="center"/>
+            </w:pPr>
+            <w:r>
+              <w:rPr>
+                <w:rFonts w:ascii="Times New Roman" w:hAnsi="Times New Roman"/>
+                <w:b w:val="0"/>
+                <w:sz w:val="18"/>
+              </w:rPr>
+              <w:t>SP500</w:t>
+            </w:r>
+          </w:p>
+        </w:tc>
+        <w:tc>
+          <w:tcPr>
+            <w:tcW w:type="dxa" w:w="3216"/>
+            <w:vAlign w:val="center"/>
+          </w:tcPr>
+          <w:p>
+            <w:pPr>
+              <w:jc w:val="center"/>
+            </w:pPr>
+            <w:r>
+              <w:rPr>
+                <w:rFonts w:ascii="Times New Roman" w:hAnsi="Times New Roman"/>
+                <w:b w:val="0"/>
+                <w:sz w:val="18"/>
+              </w:rPr>
+              <w:t>0.2941</w:t>
+            </w:r>
+          </w:p>
+        </w:tc>
+      </w:tr>
+      <w:tr>
+        <w:tc>
+          <w:tcPr>
+            <w:tcW w:type="dxa" w:w="3216"/>
+            <w:vAlign w:val="center"/>
+          </w:tcPr>
+          <w:p>
+            <w:pPr>
+              <w:jc w:val="center"/>
+            </w:pPr>
+            <w:r>
+              <w:rPr>
+                <w:rFonts w:ascii="Times New Roman" w:hAnsi="Times New Roman"/>
+                <w:b w:val="0"/>
+                <w:sz w:val="18"/>
+              </w:rPr>
+              <w:t>3</w:t>
+            </w:r>
+          </w:p>
+        </w:tc>
+        <w:tc>
+          <w:tcPr>
+            <w:tcW w:type="dxa" w:w="3216"/>
+            <w:vAlign w:val="center"/>
+          </w:tcPr>
+          <w:p>
+            <w:pPr>
+              <w:jc w:val="center"/>
+            </w:pPr>
+            <w:r>
+              <w:rPr>
+                <w:rFonts w:ascii="Times New Roman" w:hAnsi="Times New Roman"/>
+                <w:b w:val="0"/>
+                <w:sz w:val="18"/>
+              </w:rPr>
+              <w:t>FTSE100</w:t>
+            </w:r>
+          </w:p>
+        </w:tc>
+        <w:tc>
+          <w:tcPr>
+            <w:tcW w:type="dxa" w:w="3216"/>
+            <w:vAlign w:val="center"/>
+          </w:tcPr>
+          <w:p>
+            <w:pPr>
+              <w:jc w:val="center"/>
+            </w:pPr>
+            <w:r>
+              <w:rPr>
+                <w:rFonts w:ascii="Times New Roman" w:hAnsi="Times New Roman"/>
+                <w:b w:val="0"/>
+                <w:sz w:val="18"/>
+              </w:rPr>
+              <w:t>0.2941</w:t>
+            </w:r>
+          </w:p>
+        </w:tc>
+      </w:tr>
+      <w:tr>
+        <w:tc>
+          <w:tcPr>
+            <w:tcW w:type="dxa" w:w="3216"/>
+            <w:vAlign w:val="center"/>
+          </w:tcPr>
+          <w:p>
+            <w:pPr>
+              <w:jc w:val="center"/>
+            </w:pPr>
+            <w:r>
+              <w:rPr>
+                <w:rFonts w:ascii="Times New Roman" w:hAnsi="Times New Roman"/>
+                <w:b w:val="0"/>
+                <w:sz w:val="18"/>
+              </w:rPr>
+              <w:t>4</w:t>
+            </w:r>
+          </w:p>
+        </w:tc>
+        <w:tc>
+          <w:tcPr>
+            <w:tcW w:type="dxa" w:w="3216"/>
+            <w:vAlign w:val="center"/>
+          </w:tcPr>
+          <w:p>
+            <w:pPr>
+              <w:jc w:val="center"/>
+            </w:pPr>
+            <w:r>
+              <w:rPr>
+                <w:rFonts w:ascii="Times New Roman" w:hAnsi="Times New Roman"/>
+                <w:b w:val="0"/>
+                <w:sz w:val="18"/>
+              </w:rPr>
+              <w:t>VIX</w:t>
+            </w:r>
+          </w:p>
+        </w:tc>
+        <w:tc>
+          <w:tcPr>
+            <w:tcW w:type="dxa" w:w="3216"/>
+            <w:vAlign w:val="center"/>
+          </w:tcPr>
+          <w:p>
+            <w:pPr>
+              <w:jc w:val="center"/>
+            </w:pPr>
+            <w:r>
+              <w:rPr>
+                <w:rFonts w:ascii="Times New Roman" w:hAnsi="Times New Roman"/>
+                <w:b w:val="0"/>
+                <w:sz w:val="18"/>
+              </w:rPr>
+              <w:t>0.2941</w:t>
+            </w:r>
+          </w:p>
+        </w:tc>
+      </w:tr>
+      <w:tr>
+        <w:tc>
+          <w:tcPr>
+            <w:tcW w:type="dxa" w:w="3216"/>
+            <w:vAlign w:val="center"/>
+          </w:tcPr>
+          <w:p>
+            <w:pPr>
+              <w:jc w:val="center"/>
+            </w:pPr>
+            <w:r>
+              <w:rPr>
+                <w:rFonts w:ascii="Times New Roman" w:hAnsi="Times New Roman"/>
+                <w:b w:val="0"/>
+                <w:sz w:val="18"/>
+              </w:rPr>
+              <w:t>5</w:t>
+            </w:r>
+          </w:p>
+        </w:tc>
+        <w:tc>
+          <w:tcPr>
+            <w:tcW w:type="dxa" w:w="3216"/>
+            <w:vAlign w:val="center"/>
+          </w:tcPr>
+          <w:p>
+            <w:pPr>
+              <w:jc w:val="center"/>
+            </w:pPr>
+            <w:r>
+              <w:rPr>
+                <w:rFonts w:ascii="Times New Roman" w:hAnsi="Times New Roman"/>
+                <w:b w:val="0"/>
+                <w:sz w:val="18"/>
+              </w:rPr>
+              <w:t>Dow_Jones</w:t>
+            </w:r>
+          </w:p>
+        </w:tc>
+        <w:tc>
+          <w:tcPr>
+            <w:tcW w:type="dxa" w:w="3216"/>
+            <w:vAlign w:val="center"/>
+          </w:tcPr>
+          <w:p>
+            <w:pPr>
+              <w:jc w:val="center"/>
+            </w:pPr>
+            <w:r>
+              <w:rPr>
+                <w:rFonts w:ascii="Times New Roman" w:hAnsi="Times New Roman"/>
+                <w:b w:val="0"/>
+                <w:sz w:val="18"/>
+              </w:rPr>
+              <w:t>0.2941</w:t>
+            </w:r>
+          </w:p>
+        </w:tc>
+      </w:tr>
+    </w:tbl>
+    <w:p>
+      <w:pPr>
+        <w:jc w:val="left"/>
+      </w:pPr>
+      <w:r>
+        <w:rPr>
+          <w:rFonts w:ascii="Times New Roman" w:hAnsi="Times New Roman"/>
+          <w:b/>
+          <w:sz w:val="22"/>
+        </w:rPr>
+        <w:t>Eigenvector Centrality İlk 5 Düğüm</w:t>
+      </w:r>
+    </w:p>
+    <w:tbl>
+      <w:tblPr>
+        <w:tblStyle w:val="TabloKlavuzu"/>
+        <w:tblW w:type="auto" w:w="0"/>
+        <w:jc w:val="center"/>
+        <w:tblLook w:firstColumn="1" w:firstRow="1" w:lastColumn="0" w:lastRow="0" w:noHBand="0" w:noVBand="1" w:val="04A0"/>
+      </w:tblPr>
+      <w:tblGrid>
+        <w:gridCol w:w="3216"/>
+        <w:gridCol w:w="3216"/>
+        <w:gridCol w:w="3216"/>
+      </w:tblGrid>
+      <w:tr>
+        <w:tc>
+          <w:tcPr>
+            <w:tcW w:type="dxa" w:w="3216"/>
+            <w:vAlign w:val="center"/>
+          </w:tcPr>
+          <w:p>
+            <w:pPr>
+              <w:jc w:val="center"/>
+            </w:pPr>
+            <w:r>
+              <w:rPr>
+                <w:rFonts w:ascii="Times New Roman" w:hAnsi="Times New Roman"/>
+                <w:b w:val="0"/>
+                <w:sz w:val="18"/>
+              </w:rPr>
+              <w:t>Sıra</w:t>
+            </w:r>
+          </w:p>
+        </w:tc>
+        <w:tc>
+          <w:tcPr>
+            <w:tcW w:type="dxa" w:w="3216"/>
+            <w:vAlign w:val="center"/>
+          </w:tcPr>
+          <w:p>
+            <w:pPr>
+              <w:jc w:val="center"/>
+            </w:pPr>
+            <w:r>
+              <w:rPr>
+                <w:rFonts w:ascii="Times New Roman" w:hAnsi="Times New Roman"/>
+                <w:b w:val="0"/>
+                <w:sz w:val="18"/>
+              </w:rPr>
+              <w:t>Düğüm</w:t>
+            </w:r>
+          </w:p>
+        </w:tc>
+        <w:tc>
+          <w:tcPr>
+            <w:tcW w:type="dxa" w:w="3216"/>
+            <w:vAlign w:val="center"/>
+          </w:tcPr>
+          <w:p>
+            <w:pPr>
+              <w:jc w:val="center"/>
+            </w:pPr>
+            <w:r>
+              <w:rPr>
+                <w:rFonts w:ascii="Times New Roman" w:hAnsi="Times New Roman"/>
+                <w:b w:val="0"/>
+                <w:sz w:val="18"/>
+              </w:rPr>
+              <w:t>Değer</w:t>
+            </w:r>
+          </w:p>
+        </w:tc>
+      </w:tr>
+      <w:tr>
+        <w:tc>
+          <w:tcPr>
+            <w:tcW w:type="dxa" w:w="3216"/>
+            <w:vAlign w:val="center"/>
+          </w:tcPr>
+          <w:p>
+            <w:pPr>
+              <w:jc w:val="center"/>
+            </w:pPr>
+            <w:r>
+              <w:rPr>
+                <w:rFonts w:ascii="Times New Roman" w:hAnsi="Times New Roman"/>
+                <w:b w:val="0"/>
+                <w:sz w:val="18"/>
+              </w:rPr>
+              <w:t>1</w:t>
+            </w:r>
+          </w:p>
+        </w:tc>
+        <w:tc>
+          <w:tcPr>
+            <w:tcW w:type="dxa" w:w="3216"/>
+            <w:vAlign w:val="center"/>
+          </w:tcPr>
+          <w:p>
+            <w:pPr>
+              <w:jc w:val="center"/>
+            </w:pPr>
+            <w:r>
+              <w:rPr>
+                <w:rFonts w:ascii="Times New Roman" w:hAnsi="Times New Roman"/>
+                <w:b w:val="0"/>
+                <w:sz w:val="18"/>
+              </w:rPr>
+              <w:t>DAX</w:t>
+            </w:r>
+          </w:p>
+        </w:tc>
+        <w:tc>
+          <w:tcPr>
+            <w:tcW w:type="dxa" w:w="3216"/>
+            <w:vAlign w:val="center"/>
+          </w:tcPr>
+          <w:p>
+            <w:pPr>
+              <w:jc w:val="center"/>
+            </w:pPr>
+            <w:r>
+              <w:rPr>
+                <w:rFonts w:ascii="Times New Roman" w:hAnsi="Times New Roman"/>
+                <w:b w:val="0"/>
+                <w:sz w:val="18"/>
+              </w:rPr>
+              <w:t>0.4082</w:t>
+            </w:r>
+          </w:p>
+        </w:tc>
+      </w:tr>
+      <w:tr>
+        <w:tc>
+          <w:tcPr>
+            <w:tcW w:type="dxa" w:w="3216"/>
+            <w:vAlign w:val="center"/>
+          </w:tcPr>
+          <w:p>
+            <w:pPr>
+              <w:jc w:val="center"/>
+            </w:pPr>
+            <w:r>
+              <w:rPr>
+                <w:rFonts w:ascii="Times New Roman" w:hAnsi="Times New Roman"/>
+                <w:b w:val="0"/>
+                <w:sz w:val="18"/>
+              </w:rPr>
+              <w:t>2</w:t>
+            </w:r>
+          </w:p>
+        </w:tc>
+        <w:tc>
+          <w:tcPr>
+            <w:tcW w:type="dxa" w:w="3216"/>
+            <w:vAlign w:val="center"/>
+          </w:tcPr>
+          <w:p>
+            <w:pPr>
+              <w:jc w:val="center"/>
+            </w:pPr>
+            <w:r>
+              <w:rPr>
+                <w:rFonts w:ascii="Times New Roman" w:hAnsi="Times New Roman"/>
+                <w:b w:val="0"/>
+                <w:sz w:val="18"/>
+              </w:rPr>
+              <w:t>SP500</w:t>
+            </w:r>
+          </w:p>
+        </w:tc>
+        <w:tc>
+          <w:tcPr>
+            <w:tcW w:type="dxa" w:w="3216"/>
+            <w:vAlign w:val="center"/>
+          </w:tcPr>
+          <w:p>
+            <w:pPr>
+              <w:jc w:val="center"/>
+            </w:pPr>
+            <w:r>
+              <w:rPr>
+                <w:rFonts w:ascii="Times New Roman" w:hAnsi="Times New Roman"/>
+                <w:b w:val="0"/>
+                <w:sz w:val="18"/>
+              </w:rPr>
+              <w:t>0.4082</w:t>
+            </w:r>
+          </w:p>
+        </w:tc>
+      </w:tr>
+      <w:tr>
+        <w:tc>
+          <w:tcPr>
+            <w:tcW w:type="dxa" w:w="3216"/>
+            <w:vAlign w:val="center"/>
+          </w:tcPr>
+          <w:p>
+            <w:pPr>
+              <w:jc w:val="center"/>
+            </w:pPr>
+            <w:r>
+              <w:rPr>
+                <w:rFonts w:ascii="Times New Roman" w:hAnsi="Times New Roman"/>
+                <w:b w:val="0"/>
+                <w:sz w:val="18"/>
+              </w:rPr>
+              <w:t>3</w:t>
+            </w:r>
+          </w:p>
+        </w:tc>
+        <w:tc>
+          <w:tcPr>
+            <w:tcW w:type="dxa" w:w="3216"/>
+            <w:vAlign w:val="center"/>
+          </w:tcPr>
+          <w:p>
+            <w:pPr>
+              <w:jc w:val="center"/>
+            </w:pPr>
+            <w:r>
+              <w:rPr>
+                <w:rFonts w:ascii="Times New Roman" w:hAnsi="Times New Roman"/>
+                <w:b w:val="0"/>
+                <w:sz w:val="18"/>
+              </w:rPr>
+              <w:t>FTSE100</w:t>
+            </w:r>
+          </w:p>
+        </w:tc>
+        <w:tc>
+          <w:tcPr>
+            <w:tcW w:type="dxa" w:w="3216"/>
+            <w:vAlign w:val="center"/>
+          </w:tcPr>
+          <w:p>
+            <w:pPr>
+              <w:jc w:val="center"/>
+            </w:pPr>
+            <w:r>
+              <w:rPr>
+                <w:rFonts w:ascii="Times New Roman" w:hAnsi="Times New Roman"/>
+                <w:b w:val="0"/>
+                <w:sz w:val="18"/>
+              </w:rPr>
+              <w:t>0.4082</w:t>
+            </w:r>
+          </w:p>
+        </w:tc>
+      </w:tr>
+      <w:tr>
+        <w:tc>
+          <w:tcPr>
+            <w:tcW w:type="dxa" w:w="3216"/>
+            <w:vAlign w:val="center"/>
+          </w:tcPr>
+          <w:p>
+            <w:pPr>
+              <w:jc w:val="center"/>
+            </w:pPr>
+            <w:r>
+              <w:rPr>
+                <w:rFonts w:ascii="Times New Roman" w:hAnsi="Times New Roman"/>
+                <w:b w:val="0"/>
+                <w:sz w:val="18"/>
+              </w:rPr>
+              <w:t>4</w:t>
+            </w:r>
+          </w:p>
+        </w:tc>
+        <w:tc>
+          <w:tcPr>
+            <w:tcW w:type="dxa" w:w="3216"/>
+            <w:vAlign w:val="center"/>
+          </w:tcPr>
+          <w:p>
+            <w:pPr>
+              <w:jc w:val="center"/>
+            </w:pPr>
+            <w:r>
+              <w:rPr>
+                <w:rFonts w:ascii="Times New Roman" w:hAnsi="Times New Roman"/>
+                <w:b w:val="0"/>
+                <w:sz w:val="18"/>
+              </w:rPr>
+              <w:t>VIX</w:t>
+            </w:r>
+          </w:p>
+        </w:tc>
+        <w:tc>
+          <w:tcPr>
+            <w:tcW w:type="dxa" w:w="3216"/>
+            <w:vAlign w:val="center"/>
+          </w:tcPr>
+          <w:p>
+            <w:pPr>
+              <w:jc w:val="center"/>
+            </w:pPr>
+            <w:r>
+              <w:rPr>
+                <w:rFonts w:ascii="Times New Roman" w:hAnsi="Times New Roman"/>
+                <w:b w:val="0"/>
+                <w:sz w:val="18"/>
+              </w:rPr>
+              <w:t>0.4082</w:t>
+            </w:r>
+          </w:p>
+        </w:tc>
+      </w:tr>
+      <w:tr>
+        <w:tc>
+          <w:tcPr>
+            <w:tcW w:type="dxa" w:w="3216"/>
+            <w:vAlign w:val="center"/>
+          </w:tcPr>
+          <w:p>
+            <w:pPr>
+              <w:jc w:val="center"/>
+            </w:pPr>
+            <w:r>
+              <w:rPr>
+                <w:rFonts w:ascii="Times New Roman" w:hAnsi="Times New Roman"/>
+                <w:b w:val="0"/>
+                <w:sz w:val="18"/>
+              </w:rPr>
+              <w:t>5</w:t>
+            </w:r>
+          </w:p>
+        </w:tc>
+        <w:tc>
+          <w:tcPr>
+            <w:tcW w:type="dxa" w:w="3216"/>
+            <w:vAlign w:val="center"/>
+          </w:tcPr>
+          <w:p>
+            <w:pPr>
+              <w:jc w:val="center"/>
+            </w:pPr>
+            <w:r>
+              <w:rPr>
+                <w:rFonts w:ascii="Times New Roman" w:hAnsi="Times New Roman"/>
+                <w:b w:val="0"/>
+                <w:sz w:val="18"/>
+              </w:rPr>
+              <w:t>Dow_Jones</w:t>
+            </w:r>
+          </w:p>
+        </w:tc>
+        <w:tc>
+          <w:tcPr>
+            <w:tcW w:type="dxa" w:w="3216"/>
+            <w:vAlign w:val="center"/>
+          </w:tcPr>
+          <w:p>
+            <w:pPr>
+              <w:jc w:val="center"/>
+            </w:pPr>
+            <w:r>
+              <w:rPr>
+                <w:rFonts w:ascii="Times New Roman" w:hAnsi="Times New Roman"/>
+                <w:b w:val="0"/>
+                <w:sz w:val="18"/>
+              </w:rPr>
+              <w:t>0.4082</w:t>
+            </w:r>
+          </w:p>
+        </w:tc>
+      </w:tr>
+    </w:tbl>
     <w:p>
       <w:pPr>
         <w:pStyle w:val="Balk2"/>
@@ -8416,34 +10000,46 @@
           </w:tcPr>
           <w:p>
             <w:pPr>
-              <w:spacing w:after="60"/>
               <w:jc w:val="center"/>
             </w:pPr>
             <w:r>
               <w:rPr>
                 <w:rFonts w:ascii="Times New Roman" w:hAnsi="Times New Roman"/>
+              </w:rPr>
+            </w:r>
+            <w:r>
+              <w:rPr>
+                <w:rFonts w:ascii="Times New Roman" w:hAnsi="Times New Roman"/>
                 <w:b/>
-                <w:sz w:val="18"/>
-              </w:rPr>
-              <w:t>?ekil 4 - Community Detection Network G?rseli</w:t>
-              <w:br/>
+                <w:sz w:val="20"/>
+              </w:rPr>
+              <w:t>Şekil 4 - Community Detection Network Görseli</w:t>
+            </w:r>
+          </w:p>
+          <w:p>
+            <w:pPr>
+              <w:jc w:val="center"/>
+            </w:pPr>
+            <w:r>
+              <w:rPr>
+                <w:rFonts w:ascii="Times New Roman" w:hAnsi="Times New Roman"/>
+                <w:sz w:val="18"/>
+              </w:rPr>
               <w:t>Dosya: outputs/graphs/community_network.png</w:t>
             </w:r>
           </w:p>
           <w:p>
             <w:pPr>
-              <w:spacing w:after="60"/>
               <w:jc w:val="center"/>
             </w:pPr>
             <w:r>
               <w:rPr>
                 <w:rFonts w:ascii="Times New Roman" w:hAnsi="Times New Roman"/>
-                <w:sz w:val="18"/>
               </w:rPr>
               <w:drawing>
                 <wp:inline xmlns:a="http://schemas.openxmlformats.org/drawingml/2006/main" xmlns:pic="http://schemas.openxmlformats.org/drawingml/2006/picture">
-                  <wp:extent cx="5760720" cy="4474481"/>
-                  <wp:docPr id="3" name="Picture 3"/>
+                  <wp:extent cx="5669280" cy="4030365"/>
+                  <wp:docPr id="8" name="Picture 8"/>
                   <wp:cNvGraphicFramePr>
                     <a:graphicFrameLocks noChangeAspect="1"/>
                   </wp:cNvGraphicFramePr>
@@ -8455,7 +10051,7 @@
                           <pic:cNvPicPr/>
                         </pic:nvPicPr>
                         <pic:blipFill>
-                          <a:blip r:embed="rId13"/>
+                          <a:blip r:embed="rId17"/>
                           <a:stretch>
                             <a:fillRect/>
                           </a:stretch>
@@ -8463,7 +10059,7 @@
                         <pic:spPr>
                           <a:xfrm>
                             <a:off x="0" y="0"/>
-                            <a:ext cx="5760720" cy="4474481"/>
+                            <a:ext cx="5669280" cy="4030365"/>
                           </a:xfrm>
                           <a:prstGeom prst="rect"/>
                         </pic:spPr>

</xml_diff>

<commit_message>
Enhance network analysis and visualization
- Updated community detection to include weights and random state for better partitioning.
- Improved community visualization with distinct colors and labels for each community.
- Added legends to community plots for clarity on correlations.
- Enhanced network visualization with a color gradient based on degree centrality.
- Introduced average degree calculation and metrics for the largest connected component.
- Added functionality to save global network metrics to CSV.
- Included new metrics in the output for better analysis of network properties.
- Added new graphs for top degree nodes and updated existing graph outputs.
</commit_message>
<xml_diff>
--- a/report/finansal_ag_analizi_raporu_duzenlenmis.docx
+++ b/report/finansal_ag_analizi_raporu_duzenlenmis.docx
@@ -6324,11 +6324,7 @@
             <w:pPr>
               <w:jc w:val="center"/>
             </w:pPr>
-            <w:r>
-              <w:rPr>
-                <w:rFonts w:ascii="Times New Roman" w:hAnsi="Times New Roman"/>
-              </w:rPr>
-            </w:r>
+            <w:r/>
             <w:r>
               <w:rPr>
                 <w:rFonts w:ascii="Times New Roman" w:hAnsi="Times New Roman"/>
@@ -6355,13 +6351,10 @@
               <w:jc w:val="center"/>
             </w:pPr>
             <w:r>
-              <w:rPr>
-                <w:rFonts w:ascii="Times New Roman" w:hAnsi="Times New Roman"/>
-              </w:rPr>
               <w:drawing>
                 <wp:inline xmlns:a="http://schemas.openxmlformats.org/drawingml/2006/main" xmlns:pic="http://schemas.openxmlformats.org/drawingml/2006/picture">
-                  <wp:extent cx="5303520" cy="2651760"/>
-                  <wp:docPr id="7" name="Picture 7"/>
+                  <wp:extent cx="5303520" cy="2623534"/>
+                  <wp:docPr id="9" name="Picture 9"/>
                   <wp:cNvGraphicFramePr>
                     <a:graphicFrameLocks noChangeAspect="1"/>
                   </wp:cNvGraphicFramePr>
@@ -6373,7 +6366,7 @@
                           <pic:cNvPicPr/>
                         </pic:nvPicPr>
                         <pic:blipFill>
-                          <a:blip r:embed="rId12"/>
+                          <a:blip r:embed="rId18"/>
                           <a:stretch>
                             <a:fillRect/>
                           </a:stretch>
@@ -6381,7 +6374,7 @@
                         <pic:spPr>
                           <a:xfrm>
                             <a:off x="0" y="0"/>
-                            <a:ext cx="5303520" cy="2651760"/>
+                            <a:ext cx="5303520" cy="2623534"/>
                           </a:xfrm>
                           <a:prstGeom prst="rect"/>
                         </pic:spPr>
@@ -6579,15 +6572,14 @@
           </w:tcPr>
           <w:p>
             <w:pPr>
-              <w:spacing w:after="60"/>
-              <w:jc w:val="left"/>
-            </w:pPr>
-            <w:r>
-              <w:rPr>
-                <w:rFonts w:ascii="Times New Roman" w:hAnsi="Times New Roman"/>
-                <w:sz w:val="18"/>
-              </w:rPr>
-              <w:t>FTSE100</w:t>
+              <w:jc w:val="center"/>
+            </w:pPr>
+            <w:r>
+              <w:rPr>
+                <w:rFonts w:ascii="Times New Roman" w:hAnsi="Times New Roman"/>
+                <w:sz w:val="18"/>
+              </w:rPr>
+              <w:t>DAX</w:t>
             </w:r>
           </w:p>
         </w:tc>
@@ -6598,15 +6590,14 @@
           </w:tcPr>
           <w:p>
             <w:pPr>
-              <w:spacing w:after="60"/>
-              <w:jc w:val="left"/>
-            </w:pPr>
-            <w:r>
-              <w:rPr>
-                <w:rFonts w:ascii="Times New Roman" w:hAnsi="Times New Roman"/>
-                <w:sz w:val="18"/>
-              </w:rPr>
-              <w:t>0.4167</w:t>
+              <w:jc w:val="center"/>
+            </w:pPr>
+            <w:r>
+              <w:rPr>
+                <w:rFonts w:ascii="Times New Roman" w:hAnsi="Times New Roman"/>
+                <w:sz w:val="18"/>
+              </w:rPr>
+              <w:t>0.2941</w:t>
             </w:r>
           </w:p>
         </w:tc>
@@ -6617,8 +6608,7 @@
           </w:tcPr>
           <w:p>
             <w:pPr>
-              <w:spacing w:after="60"/>
-              <w:jc w:val="left"/>
+              <w:jc w:val="center"/>
             </w:pPr>
             <w:r>
               <w:rPr>
@@ -6636,15 +6626,14 @@
           </w:tcPr>
           <w:p>
             <w:pPr>
-              <w:spacing w:after="60"/>
-              <w:jc w:val="left"/>
-            </w:pPr>
-            <w:r>
-              <w:rPr>
-                <w:rFonts w:ascii="Times New Roman" w:hAnsi="Times New Roman"/>
-                <w:sz w:val="18"/>
-              </w:rPr>
-              <w:t>0.4167</w:t>
+              <w:jc w:val="center"/>
+            </w:pPr>
+            <w:r>
+              <w:rPr>
+                <w:rFonts w:ascii="Times New Roman" w:hAnsi="Times New Roman"/>
+                <w:sz w:val="18"/>
+              </w:rPr>
+              <w:t>0.2941</w:t>
             </w:r>
           </w:p>
         </w:tc>
@@ -6655,8 +6644,7 @@
           </w:tcPr>
           <w:p>
             <w:pPr>
-              <w:spacing w:after="60"/>
-              <w:jc w:val="left"/>
+              <w:jc w:val="center"/>
             </w:pPr>
             <w:r>
               <w:rPr>
@@ -6674,8 +6662,7 @@
           </w:tcPr>
           <w:p>
             <w:pPr>
-              <w:spacing w:after="60"/>
-              <w:jc w:val="left"/>
+              <w:jc w:val="center"/>
             </w:pPr>
             <w:r>
               <w:rPr>
@@ -6698,15 +6685,14 @@
           </w:tcPr>
           <w:p>
             <w:pPr>
-              <w:spacing w:after="60"/>
-              <w:jc w:val="left"/>
-            </w:pPr>
-            <w:r>
-              <w:rPr>
-                <w:rFonts w:ascii="Times New Roman" w:hAnsi="Times New Roman"/>
-                <w:sz w:val="18"/>
-              </w:rPr>
-              <w:t>DAX</w:t>
+              <w:jc w:val="center"/>
+            </w:pPr>
+            <w:r>
+              <w:rPr>
+                <w:rFonts w:ascii="Times New Roman" w:hAnsi="Times New Roman"/>
+                <w:sz w:val="18"/>
+              </w:rPr>
+              <w:t>SP500</w:t>
             </w:r>
           </w:p>
         </w:tc>
@@ -6717,15 +6703,14 @@
           </w:tcPr>
           <w:p>
             <w:pPr>
-              <w:spacing w:after="60"/>
-              <w:jc w:val="left"/>
-            </w:pPr>
-            <w:r>
-              <w:rPr>
-                <w:rFonts w:ascii="Times New Roman" w:hAnsi="Times New Roman"/>
-                <w:sz w:val="18"/>
-              </w:rPr>
-              <w:t>0.4167</w:t>
+              <w:jc w:val="center"/>
+            </w:pPr>
+            <w:r>
+              <w:rPr>
+                <w:rFonts w:ascii="Times New Roman" w:hAnsi="Times New Roman"/>
+                <w:sz w:val="18"/>
+              </w:rPr>
+              <w:t>0.2941</w:t>
             </w:r>
           </w:p>
         </w:tc>
@@ -6736,8 +6721,7 @@
           </w:tcPr>
           <w:p>
             <w:pPr>
-              <w:spacing w:after="60"/>
-              <w:jc w:val="left"/>
+              <w:jc w:val="center"/>
             </w:pPr>
             <w:r>
               <w:rPr>
@@ -6755,15 +6739,14 @@
           </w:tcPr>
           <w:p>
             <w:pPr>
-              <w:spacing w:after="60"/>
-              <w:jc w:val="left"/>
-            </w:pPr>
-            <w:r>
-              <w:rPr>
-                <w:rFonts w:ascii="Times New Roman" w:hAnsi="Times New Roman"/>
-                <w:sz w:val="18"/>
-              </w:rPr>
-              <w:t>0.4167</w:t>
+              <w:jc w:val="center"/>
+            </w:pPr>
+            <w:r>
+              <w:rPr>
+                <w:rFonts w:ascii="Times New Roman" w:hAnsi="Times New Roman"/>
+                <w:sz w:val="18"/>
+              </w:rPr>
+              <w:t>0.2941</w:t>
             </w:r>
           </w:p>
         </w:tc>
@@ -6774,8 +6757,7 @@
           </w:tcPr>
           <w:p>
             <w:pPr>
-              <w:spacing w:after="60"/>
-              <w:jc w:val="left"/>
+              <w:jc w:val="center"/>
             </w:pPr>
             <w:r>
               <w:rPr>
@@ -6793,8 +6775,7 @@
           </w:tcPr>
           <w:p>
             <w:pPr>
-              <w:spacing w:after="60"/>
-              <w:jc w:val="left"/>
+              <w:jc w:val="center"/>
             </w:pPr>
             <w:r>
               <w:rPr>
@@ -6817,15 +6798,14 @@
           </w:tcPr>
           <w:p>
             <w:pPr>
-              <w:spacing w:after="60"/>
-              <w:jc w:val="left"/>
-            </w:pPr>
-            <w:r>
-              <w:rPr>
-                <w:rFonts w:ascii="Times New Roman" w:hAnsi="Times New Roman"/>
-                <w:sz w:val="18"/>
-              </w:rPr>
-              <w:t>Dow_Jones</w:t>
+              <w:jc w:val="center"/>
+            </w:pPr>
+            <w:r>
+              <w:rPr>
+                <w:rFonts w:ascii="Times New Roman" w:hAnsi="Times New Roman"/>
+                <w:sz w:val="18"/>
+              </w:rPr>
+              <w:t>FTSE100</w:t>
             </w:r>
           </w:p>
         </w:tc>
@@ -6836,15 +6816,14 @@
           </w:tcPr>
           <w:p>
             <w:pPr>
-              <w:spacing w:after="60"/>
-              <w:jc w:val="left"/>
-            </w:pPr>
-            <w:r>
-              <w:rPr>
-                <w:rFonts w:ascii="Times New Roman" w:hAnsi="Times New Roman"/>
-                <w:sz w:val="18"/>
-              </w:rPr>
-              <w:t>0.4167</w:t>
+              <w:jc w:val="center"/>
+            </w:pPr>
+            <w:r>
+              <w:rPr>
+                <w:rFonts w:ascii="Times New Roman" w:hAnsi="Times New Roman"/>
+                <w:sz w:val="18"/>
+              </w:rPr>
+              <w:t>0.2941</w:t>
             </w:r>
           </w:p>
         </w:tc>
@@ -6855,8 +6834,7 @@
           </w:tcPr>
           <w:p>
             <w:pPr>
-              <w:spacing w:after="60"/>
-              <w:jc w:val="left"/>
+              <w:jc w:val="center"/>
             </w:pPr>
             <w:r>
               <w:rPr>
@@ -6874,15 +6852,14 @@
           </w:tcPr>
           <w:p>
             <w:pPr>
-              <w:spacing w:after="60"/>
-              <w:jc w:val="left"/>
-            </w:pPr>
-            <w:r>
-              <w:rPr>
-                <w:rFonts w:ascii="Times New Roman" w:hAnsi="Times New Roman"/>
-                <w:sz w:val="18"/>
-              </w:rPr>
-              <w:t>0.4167</w:t>
+              <w:jc w:val="center"/>
+            </w:pPr>
+            <w:r>
+              <w:rPr>
+                <w:rFonts w:ascii="Times New Roman" w:hAnsi="Times New Roman"/>
+                <w:sz w:val="18"/>
+              </w:rPr>
+              <w:t>0.2941</w:t>
             </w:r>
           </w:p>
         </w:tc>
@@ -6893,8 +6870,7 @@
           </w:tcPr>
           <w:p>
             <w:pPr>
-              <w:spacing w:after="60"/>
-              <w:jc w:val="left"/>
+              <w:jc w:val="center"/>
             </w:pPr>
             <w:r>
               <w:rPr>
@@ -6912,8 +6888,7 @@
           </w:tcPr>
           <w:p>
             <w:pPr>
-              <w:spacing w:after="60"/>
-              <w:jc w:val="left"/>
+              <w:jc w:val="center"/>
             </w:pPr>
             <w:r>
               <w:rPr>
@@ -6936,15 +6911,14 @@
           </w:tcPr>
           <w:p>
             <w:pPr>
-              <w:spacing w:after="60"/>
-              <w:jc w:val="left"/>
-            </w:pPr>
-            <w:r>
-              <w:rPr>
-                <w:rFonts w:ascii="Times New Roman" w:hAnsi="Times New Roman"/>
-                <w:sz w:val="18"/>
-              </w:rPr>
-              <w:t>NASDAQ</w:t>
+              <w:jc w:val="center"/>
+            </w:pPr>
+            <w:r>
+              <w:rPr>
+                <w:rFonts w:ascii="Times New Roman" w:hAnsi="Times New Roman"/>
+                <w:sz w:val="18"/>
+              </w:rPr>
+              <w:t>VIX</w:t>
             </w:r>
           </w:p>
         </w:tc>
@@ -6955,15 +6929,14 @@
           </w:tcPr>
           <w:p>
             <w:pPr>
-              <w:spacing w:after="60"/>
-              <w:jc w:val="left"/>
-            </w:pPr>
-            <w:r>
-              <w:rPr>
-                <w:rFonts w:ascii="Times New Roman" w:hAnsi="Times New Roman"/>
-                <w:sz w:val="18"/>
-              </w:rPr>
-              <w:t>0.4167</w:t>
+              <w:jc w:val="center"/>
+            </w:pPr>
+            <w:r>
+              <w:rPr>
+                <w:rFonts w:ascii="Times New Roman" w:hAnsi="Times New Roman"/>
+                <w:sz w:val="18"/>
+              </w:rPr>
+              <w:t>0.2941</w:t>
             </w:r>
           </w:p>
         </w:tc>
@@ -6974,15 +6947,14 @@
           </w:tcPr>
           <w:p>
             <w:pPr>
-              <w:spacing w:after="60"/>
-              <w:jc w:val="left"/>
-            </w:pPr>
-            <w:r>
-              <w:rPr>
-                <w:rFonts w:ascii="Times New Roman" w:hAnsi="Times New Roman"/>
-                <w:sz w:val="18"/>
-              </w:rPr>
-              <w:t>0.0000</w:t>
+              <w:jc w:val="center"/>
+            </w:pPr>
+            <w:r>
+              <w:rPr>
+                <w:rFonts w:ascii="Times New Roman" w:hAnsi="Times New Roman"/>
+                <w:sz w:val="18"/>
+              </w:rPr>
+              <w:t>0.0735</w:t>
             </w:r>
           </w:p>
         </w:tc>
@@ -6993,15 +6965,14 @@
           </w:tcPr>
           <w:p>
             <w:pPr>
-              <w:spacing w:after="60"/>
-              <w:jc w:val="left"/>
-            </w:pPr>
-            <w:r>
-              <w:rPr>
-                <w:rFonts w:ascii="Times New Roman" w:hAnsi="Times New Roman"/>
-                <w:sz w:val="18"/>
-              </w:rPr>
-              <w:t>0.4167</w:t>
+              <w:jc w:val="center"/>
+            </w:pPr>
+            <w:r>
+              <w:rPr>
+                <w:rFonts w:ascii="Times New Roman" w:hAnsi="Times New Roman"/>
+                <w:sz w:val="18"/>
+              </w:rPr>
+              <w:t>0.2941</w:t>
             </w:r>
           </w:p>
         </w:tc>
@@ -7012,8 +6983,7 @@
           </w:tcPr>
           <w:p>
             <w:pPr>
-              <w:spacing w:after="60"/>
-              <w:jc w:val="left"/>
+              <w:jc w:val="center"/>
             </w:pPr>
             <w:r>
               <w:rPr>
@@ -7031,8 +7001,7 @@
           </w:tcPr>
           <w:p>
             <w:pPr>
-              <w:spacing w:after="60"/>
-              <w:jc w:val="left"/>
+              <w:jc w:val="center"/>
             </w:pPr>
             <w:r>
               <w:rPr>
@@ -7055,15 +7024,14 @@
           </w:tcPr>
           <w:p>
             <w:pPr>
-              <w:spacing w:after="60"/>
-              <w:jc w:val="left"/>
-            </w:pPr>
-            <w:r>
-              <w:rPr>
-                <w:rFonts w:ascii="Times New Roman" w:hAnsi="Times New Roman"/>
-                <w:sz w:val="18"/>
-              </w:rPr>
-              <w:t>SP500</w:t>
+              <w:jc w:val="center"/>
+            </w:pPr>
+            <w:r>
+              <w:rPr>
+                <w:rFonts w:ascii="Times New Roman" w:hAnsi="Times New Roman"/>
+                <w:sz w:val="18"/>
+              </w:rPr>
+              <w:t>Dow_Jones</w:t>
             </w:r>
           </w:p>
         </w:tc>
@@ -7074,15 +7042,14 @@
           </w:tcPr>
           <w:p>
             <w:pPr>
-              <w:spacing w:after="60"/>
-              <w:jc w:val="left"/>
-            </w:pPr>
-            <w:r>
-              <w:rPr>
-                <w:rFonts w:ascii="Times New Roman" w:hAnsi="Times New Roman"/>
-                <w:sz w:val="18"/>
-              </w:rPr>
-              <w:t>0.4167</w:t>
+              <w:jc w:val="center"/>
+            </w:pPr>
+            <w:r>
+              <w:rPr>
+                <w:rFonts w:ascii="Times New Roman" w:hAnsi="Times New Roman"/>
+                <w:sz w:val="18"/>
+              </w:rPr>
+              <w:t>0.2941</w:t>
             </w:r>
           </w:p>
         </w:tc>
@@ -7093,8 +7060,7 @@
           </w:tcPr>
           <w:p>
             <w:pPr>
-              <w:spacing w:after="60"/>
-              <w:jc w:val="left"/>
+              <w:jc w:val="center"/>
             </w:pPr>
             <w:r>
               <w:rPr>
@@ -7112,15 +7078,14 @@
           </w:tcPr>
           <w:p>
             <w:pPr>
-              <w:spacing w:after="60"/>
-              <w:jc w:val="left"/>
-            </w:pPr>
-            <w:r>
-              <w:rPr>
-                <w:rFonts w:ascii="Times New Roman" w:hAnsi="Times New Roman"/>
-                <w:sz w:val="18"/>
-              </w:rPr>
-              <w:t>0.4167</w:t>
+              <w:jc w:val="center"/>
+            </w:pPr>
+            <w:r>
+              <w:rPr>
+                <w:rFonts w:ascii="Times New Roman" w:hAnsi="Times New Roman"/>
+                <w:sz w:val="18"/>
+              </w:rPr>
+              <w:t>0.2941</w:t>
             </w:r>
           </w:p>
         </w:tc>
@@ -7131,8 +7096,7 @@
           </w:tcPr>
           <w:p>
             <w:pPr>
-              <w:spacing w:after="60"/>
-              <w:jc w:val="left"/>
+              <w:jc w:val="center"/>
             </w:pPr>
             <w:r>
               <w:rPr>
@@ -7150,8 +7114,7 @@
           </w:tcPr>
           <w:p>
             <w:pPr>
-              <w:spacing w:after="60"/>
-              <w:jc w:val="left"/>
+              <w:jc w:val="center"/>
             </w:pPr>
             <w:r>
               <w:rPr>
@@ -7174,15 +7137,14 @@
           </w:tcPr>
           <w:p>
             <w:pPr>
-              <w:spacing w:after="60"/>
-              <w:jc w:val="left"/>
-            </w:pPr>
-            <w:r>
-              <w:rPr>
-                <w:rFonts w:ascii="Times New Roman" w:hAnsi="Times New Roman"/>
-                <w:sz w:val="18"/>
-              </w:rPr>
-              <w:t>VIX</w:t>
+              <w:jc w:val="center"/>
+            </w:pPr>
+            <w:r>
+              <w:rPr>
+                <w:rFonts w:ascii="Times New Roman" w:hAnsi="Times New Roman"/>
+                <w:sz w:val="18"/>
+              </w:rPr>
+              <w:t>NASDAQ</w:t>
             </w:r>
           </w:p>
         </w:tc>
@@ -7193,15 +7155,14 @@
           </w:tcPr>
           <w:p>
             <w:pPr>
-              <w:spacing w:after="60"/>
-              <w:jc w:val="left"/>
-            </w:pPr>
-            <w:r>
-              <w:rPr>
-                <w:rFonts w:ascii="Times New Roman" w:hAnsi="Times New Roman"/>
-                <w:sz w:val="18"/>
-              </w:rPr>
-              <w:t>0.4167</w:t>
+              <w:jc w:val="center"/>
+            </w:pPr>
+            <w:r>
+              <w:rPr>
+                <w:rFonts w:ascii="Times New Roman" w:hAnsi="Times New Roman"/>
+                <w:sz w:val="18"/>
+              </w:rPr>
+              <w:t>0.2941</w:t>
             </w:r>
           </w:p>
         </w:tc>
@@ -7212,15 +7173,14 @@
           </w:tcPr>
           <w:p>
             <w:pPr>
-              <w:spacing w:after="60"/>
-              <w:jc w:val="left"/>
-            </w:pPr>
-            <w:r>
-              <w:rPr>
-                <w:rFonts w:ascii="Times New Roman" w:hAnsi="Times New Roman"/>
-                <w:sz w:val="18"/>
-              </w:rPr>
-              <w:t>0.1515</w:t>
+              <w:jc w:val="center"/>
+            </w:pPr>
+            <w:r>
+              <w:rPr>
+                <w:rFonts w:ascii="Times New Roman" w:hAnsi="Times New Roman"/>
+                <w:sz w:val="18"/>
+              </w:rPr>
+              <w:t>0.0000</w:t>
             </w:r>
           </w:p>
         </w:tc>
@@ -7231,15 +7191,14 @@
           </w:tcPr>
           <w:p>
             <w:pPr>
-              <w:spacing w:after="60"/>
-              <w:jc w:val="left"/>
-            </w:pPr>
-            <w:r>
-              <w:rPr>
-                <w:rFonts w:ascii="Times New Roman" w:hAnsi="Times New Roman"/>
-                <w:sz w:val="18"/>
-              </w:rPr>
-              <w:t>0.4167</w:t>
+              <w:jc w:val="center"/>
+            </w:pPr>
+            <w:r>
+              <w:rPr>
+                <w:rFonts w:ascii="Times New Roman" w:hAnsi="Times New Roman"/>
+                <w:sz w:val="18"/>
+              </w:rPr>
+              <w:t>0.2941</w:t>
             </w:r>
           </w:p>
         </w:tc>
@@ -7250,8 +7209,7 @@
           </w:tcPr>
           <w:p>
             <w:pPr>
-              <w:spacing w:after="60"/>
-              <w:jc w:val="left"/>
+              <w:jc w:val="center"/>
             </w:pPr>
             <w:r>
               <w:rPr>
@@ -7269,8 +7227,7 @@
           </w:tcPr>
           <w:p>
             <w:pPr>
-              <w:spacing w:after="60"/>
-              <w:jc w:val="left"/>
+              <w:jc w:val="center"/>
             </w:pPr>
             <w:r>
               <w:rPr>
@@ -7293,8 +7250,7 @@
           </w:tcPr>
           <w:p>
             <w:pPr>
-              <w:spacing w:after="60"/>
-              <w:jc w:val="left"/>
+              <w:jc w:val="center"/>
             </w:pPr>
             <w:r>
               <w:rPr>
@@ -7312,15 +7268,14 @@
           </w:tcPr>
           <w:p>
             <w:pPr>
-              <w:spacing w:after="60"/>
-              <w:jc w:val="left"/>
-            </w:pPr>
-            <w:r>
-              <w:rPr>
-                <w:rFonts w:ascii="Times New Roman" w:hAnsi="Times New Roman"/>
-                <w:sz w:val="18"/>
-              </w:rPr>
-              <w:t>0.1667</w:t>
+              <w:jc w:val="center"/>
+            </w:pPr>
+            <w:r>
+              <w:rPr>
+                <w:rFonts w:ascii="Times New Roman" w:hAnsi="Times New Roman"/>
+                <w:sz w:val="18"/>
+              </w:rPr>
+              <w:t>0.1176</w:t>
             </w:r>
           </w:p>
         </w:tc>
@@ -7331,15 +7286,14 @@
           </w:tcPr>
           <w:p>
             <w:pPr>
-              <w:spacing w:after="60"/>
-              <w:jc w:val="left"/>
-            </w:pPr>
-            <w:r>
-              <w:rPr>
-                <w:rFonts w:ascii="Times New Roman" w:hAnsi="Times New Roman"/>
-                <w:sz w:val="18"/>
-              </w:rPr>
-              <w:t>0.0152</w:t>
+              <w:jc w:val="center"/>
+            </w:pPr>
+            <w:r>
+              <w:rPr>
+                <w:rFonts w:ascii="Times New Roman" w:hAnsi="Times New Roman"/>
+                <w:sz w:val="18"/>
+              </w:rPr>
+              <w:t>0.0074</w:t>
             </w:r>
           </w:p>
         </w:tc>
@@ -7350,15 +7304,14 @@
           </w:tcPr>
           <w:p>
             <w:pPr>
-              <w:spacing w:after="60"/>
-              <w:jc w:val="left"/>
-            </w:pPr>
-            <w:r>
-              <w:rPr>
-                <w:rFonts w:ascii="Times New Roman" w:hAnsi="Times New Roman"/>
-                <w:sz w:val="18"/>
-              </w:rPr>
-              <w:t>0.1667</w:t>
+              <w:jc w:val="center"/>
+            </w:pPr>
+            <w:r>
+              <w:rPr>
+                <w:rFonts w:ascii="Times New Roman" w:hAnsi="Times New Roman"/>
+                <w:sz w:val="18"/>
+              </w:rPr>
+              <w:t>0.1176</w:t>
             </w:r>
           </w:p>
         </w:tc>
@@ -7369,8 +7322,7 @@
           </w:tcPr>
           <w:p>
             <w:pPr>
-              <w:spacing w:after="60"/>
-              <w:jc w:val="left"/>
+              <w:jc w:val="center"/>
             </w:pPr>
             <w:r>
               <w:rPr>
@@ -7388,8 +7340,7 @@
           </w:tcPr>
           <w:p>
             <w:pPr>
-              <w:spacing w:after="60"/>
-              <w:jc w:val="left"/>
+              <w:jc w:val="center"/>
             </w:pPr>
             <w:r>
               <w:rPr>
@@ -7412,16 +7363,14 @@
           </w:tcPr>
           <w:p>
             <w:pPr>
-              <w:spacing w:after="60"/>
-              <w:jc w:val="left"/>
-            </w:pPr>
-            <w:r>
-              <w:rPr>
-                <w:rFonts w:ascii="Times New Roman" w:hAnsi="Times New Roman"/>
-                <w:sz w:val="18"/>
-              </w:rPr>
-              <w:lastRenderedPageBreak/>
-              <w:t>Dollar_Index</w:t>
+              <w:jc w:val="center"/>
+            </w:pPr>
+            <w:r>
+              <w:rPr>
+                <w:rFonts w:ascii="Times New Roman" w:hAnsi="Times New Roman"/>
+                <w:sz w:val="18"/>
+              </w:rPr>
+              <w:t>Silver</w:t>
             </w:r>
           </w:p>
         </w:tc>
@@ -7432,15 +7381,14 @@
           </w:tcPr>
           <w:p>
             <w:pPr>
-              <w:spacing w:after="60"/>
-              <w:jc w:val="left"/>
-            </w:pPr>
-            <w:r>
-              <w:rPr>
-                <w:rFonts w:ascii="Times New Roman" w:hAnsi="Times New Roman"/>
-                <w:sz w:val="18"/>
-              </w:rPr>
-              <w:t>0.0833</w:t>
+              <w:jc w:val="center"/>
+            </w:pPr>
+            <w:r>
+              <w:rPr>
+                <w:rFonts w:ascii="Times New Roman" w:hAnsi="Times New Roman"/>
+                <w:sz w:val="18"/>
+              </w:rPr>
+              <w:t>0.0588</w:t>
             </w:r>
           </w:p>
         </w:tc>
@@ -7451,8 +7399,7 @@
           </w:tcPr>
           <w:p>
             <w:pPr>
-              <w:spacing w:after="60"/>
-              <w:jc w:val="left"/>
+              <w:jc w:val="center"/>
             </w:pPr>
             <w:r>
               <w:rPr>
@@ -7470,15 +7417,14 @@
           </w:tcPr>
           <w:p>
             <w:pPr>
-              <w:spacing w:after="60"/>
-              <w:jc w:val="left"/>
-            </w:pPr>
-            <w:r>
-              <w:rPr>
-                <w:rFonts w:ascii="Times New Roman" w:hAnsi="Times New Roman"/>
-                <w:sz w:val="18"/>
-              </w:rPr>
-              <w:t>0.1111</w:t>
+              <w:jc w:val="center"/>
+            </w:pPr>
+            <w:r>
+              <w:rPr>
+                <w:rFonts w:ascii="Times New Roman" w:hAnsi="Times New Roman"/>
+                <w:sz w:val="18"/>
+              </w:rPr>
+              <w:t>0.0784</w:t>
             </w:r>
           </w:p>
         </w:tc>
@@ -7489,8 +7435,7 @@
           </w:tcPr>
           <w:p>
             <w:pPr>
-              <w:spacing w:after="60"/>
-              <w:jc w:val="left"/>
+              <w:jc w:val="center"/>
             </w:pPr>
             <w:r>
               <w:rPr>
@@ -7508,8 +7453,7 @@
           </w:tcPr>
           <w:p>
             <w:pPr>
-              <w:spacing w:after="60"/>
-              <w:jc w:val="left"/>
+              <w:jc w:val="center"/>
             </w:pPr>
             <w:r>
               <w:rPr>
@@ -7532,15 +7476,14 @@
           </w:tcPr>
           <w:p>
             <w:pPr>
-              <w:spacing w:after="60"/>
-              <w:jc w:val="left"/>
-            </w:pPr>
-            <w:r>
-              <w:rPr>
-                <w:rFonts w:ascii="Times New Roman" w:hAnsi="Times New Roman"/>
-                <w:sz w:val="18"/>
-              </w:rPr>
-              <w:t>Silver</w:t>
+              <w:jc w:val="center"/>
+            </w:pPr>
+            <w:r>
+              <w:rPr>
+                <w:rFonts w:ascii="Times New Roman" w:hAnsi="Times New Roman"/>
+                <w:sz w:val="18"/>
+              </w:rPr>
+              <w:t>WTI_Oil</w:t>
             </w:r>
           </w:p>
         </w:tc>
@@ -7551,15 +7494,14 @@
           </w:tcPr>
           <w:p>
             <w:pPr>
-              <w:spacing w:after="60"/>
-              <w:jc w:val="left"/>
-            </w:pPr>
-            <w:r>
-              <w:rPr>
-                <w:rFonts w:ascii="Times New Roman" w:hAnsi="Times New Roman"/>
-                <w:sz w:val="18"/>
-              </w:rPr>
-              <w:t>0.0833</w:t>
+              <w:jc w:val="center"/>
+            </w:pPr>
+            <w:r>
+              <w:rPr>
+                <w:rFonts w:ascii="Times New Roman" w:hAnsi="Times New Roman"/>
+                <w:sz w:val="18"/>
+              </w:rPr>
+              <w:t>0.0588</w:t>
             </w:r>
           </w:p>
         </w:tc>
@@ -7570,8 +7512,7 @@
           </w:tcPr>
           <w:p>
             <w:pPr>
-              <w:spacing w:after="60"/>
-              <w:jc w:val="left"/>
+              <w:jc w:val="center"/>
             </w:pPr>
             <w:r>
               <w:rPr>
@@ -7589,15 +7530,14 @@
           </w:tcPr>
           <w:p>
             <w:pPr>
-              <w:spacing w:after="60"/>
-              <w:jc w:val="left"/>
-            </w:pPr>
-            <w:r>
-              <w:rPr>
-                <w:rFonts w:ascii="Times New Roman" w:hAnsi="Times New Roman"/>
-                <w:sz w:val="18"/>
-              </w:rPr>
-              <w:t>0.1111</w:t>
+              <w:jc w:val="center"/>
+            </w:pPr>
+            <w:r>
+              <w:rPr>
+                <w:rFonts w:ascii="Times New Roman" w:hAnsi="Times New Roman"/>
+                <w:sz w:val="18"/>
+              </w:rPr>
+              <w:t>0.0588</w:t>
             </w:r>
           </w:p>
         </w:tc>
@@ -7608,8 +7548,7 @@
           </w:tcPr>
           <w:p>
             <w:pPr>
-              <w:spacing w:after="60"/>
-              <w:jc w:val="left"/>
+              <w:jc w:val="center"/>
             </w:pPr>
             <w:r>
               <w:rPr>
@@ -7627,8 +7566,7 @@
           </w:tcPr>
           <w:p>
             <w:pPr>
-              <w:spacing w:after="60"/>
-              <w:jc w:val="left"/>
+              <w:jc w:val="center"/>
             </w:pPr>
             <w:r>
               <w:rPr>
@@ -7651,8 +7589,7 @@
           </w:tcPr>
           <w:p>
             <w:pPr>
-              <w:spacing w:after="60"/>
-              <w:jc w:val="left"/>
+              <w:jc w:val="center"/>
             </w:pPr>
             <w:r>
               <w:rPr>
@@ -7670,15 +7607,14 @@
           </w:tcPr>
           <w:p>
             <w:pPr>
-              <w:spacing w:after="60"/>
-              <w:jc w:val="left"/>
-            </w:pPr>
-            <w:r>
-              <w:rPr>
-                <w:rFonts w:ascii="Times New Roman" w:hAnsi="Times New Roman"/>
-                <w:sz w:val="18"/>
-              </w:rPr>
-              <w:t>0.0833</w:t>
+              <w:jc w:val="center"/>
+            </w:pPr>
+            <w:r>
+              <w:rPr>
+                <w:rFonts w:ascii="Times New Roman" w:hAnsi="Times New Roman"/>
+                <w:sz w:val="18"/>
+              </w:rPr>
+              <w:t>0.0588</w:t>
             </w:r>
           </w:p>
         </w:tc>
@@ -7689,8 +7625,7 @@
           </w:tcPr>
           <w:p>
             <w:pPr>
-              <w:spacing w:after="60"/>
-              <w:jc w:val="left"/>
+              <w:jc w:val="center"/>
             </w:pPr>
             <w:r>
               <w:rPr>
@@ -7708,15 +7643,14 @@
           </w:tcPr>
           <w:p>
             <w:pPr>
-              <w:spacing w:after="60"/>
-              <w:jc w:val="left"/>
-            </w:pPr>
-            <w:r>
-              <w:rPr>
-                <w:rFonts w:ascii="Times New Roman" w:hAnsi="Times New Roman"/>
-                <w:sz w:val="18"/>
-              </w:rPr>
-              <w:t>0.0833</w:t>
+              <w:jc w:val="center"/>
+            </w:pPr>
+            <w:r>
+              <w:rPr>
+                <w:rFonts w:ascii="Times New Roman" w:hAnsi="Times New Roman"/>
+                <w:sz w:val="18"/>
+              </w:rPr>
+              <w:t>0.0588</w:t>
             </w:r>
           </w:p>
         </w:tc>
@@ -7727,8 +7661,7 @@
           </w:tcPr>
           <w:p>
             <w:pPr>
-              <w:spacing w:after="60"/>
-              <w:jc w:val="left"/>
+              <w:jc w:val="center"/>
             </w:pPr>
             <w:r>
               <w:rPr>
@@ -7746,8 +7679,7 @@
           </w:tcPr>
           <w:p>
             <w:pPr>
-              <w:spacing w:after="60"/>
-              <w:jc w:val="left"/>
+              <w:jc w:val="center"/>
             </w:pPr>
             <w:r>
               <w:rPr>
@@ -7770,15 +7702,14 @@
           </w:tcPr>
           <w:p>
             <w:pPr>
-              <w:spacing w:after="60"/>
-              <w:jc w:val="left"/>
-            </w:pPr>
-            <w:r>
-              <w:rPr>
-                <w:rFonts w:ascii="Times New Roman" w:hAnsi="Times New Roman"/>
-                <w:sz w:val="18"/>
-              </w:rPr>
-              <w:t>WTI_Oil</w:t>
+              <w:jc w:val="center"/>
+            </w:pPr>
+            <w:r>
+              <w:rPr>
+                <w:rFonts w:ascii="Times New Roman" w:hAnsi="Times New Roman"/>
+                <w:sz w:val="18"/>
+              </w:rPr>
+              <w:t>Dollar_Index</w:t>
             </w:r>
           </w:p>
         </w:tc>
@@ -7789,15 +7720,14 @@
           </w:tcPr>
           <w:p>
             <w:pPr>
-              <w:spacing w:after="60"/>
-              <w:jc w:val="left"/>
-            </w:pPr>
-            <w:r>
-              <w:rPr>
-                <w:rFonts w:ascii="Times New Roman" w:hAnsi="Times New Roman"/>
-                <w:sz w:val="18"/>
-              </w:rPr>
-              <w:t>0.0833</w:t>
+              <w:jc w:val="center"/>
+            </w:pPr>
+            <w:r>
+              <w:rPr>
+                <w:rFonts w:ascii="Times New Roman" w:hAnsi="Times New Roman"/>
+                <w:sz w:val="18"/>
+              </w:rPr>
+              <w:t>0.0588</w:t>
             </w:r>
           </w:p>
         </w:tc>
@@ -7808,8 +7738,7 @@
           </w:tcPr>
           <w:p>
             <w:pPr>
-              <w:spacing w:after="60"/>
-              <w:jc w:val="left"/>
+              <w:jc w:val="center"/>
             </w:pPr>
             <w:r>
               <w:rPr>
@@ -7827,15 +7756,14 @@
           </w:tcPr>
           <w:p>
             <w:pPr>
-              <w:spacing w:after="60"/>
-              <w:jc w:val="left"/>
-            </w:pPr>
-            <w:r>
-              <w:rPr>
-                <w:rFonts w:ascii="Times New Roman" w:hAnsi="Times New Roman"/>
-                <w:sz w:val="18"/>
-              </w:rPr>
-              <w:t>0.0833</w:t>
+              <w:jc w:val="center"/>
+            </w:pPr>
+            <w:r>
+              <w:rPr>
+                <w:rFonts w:ascii="Times New Roman" w:hAnsi="Times New Roman"/>
+                <w:sz w:val="18"/>
+              </w:rPr>
+              <w:t>0.0784</w:t>
             </w:r>
           </w:p>
         </w:tc>
@@ -7846,8 +7774,7 @@
           </w:tcPr>
           <w:p>
             <w:pPr>
-              <w:spacing w:after="60"/>
-              <w:jc w:val="left"/>
+              <w:jc w:val="center"/>
             </w:pPr>
             <w:r>
               <w:rPr>
@@ -7865,8 +7792,7 @@
           </w:tcPr>
           <w:p>
             <w:pPr>
-              <w:spacing w:after="60"/>
-              <w:jc w:val="left"/>
+              <w:jc w:val="center"/>
             </w:pPr>
             <w:r>
               <w:rPr>
@@ -7889,15 +7815,14 @@
           </w:tcPr>
           <w:p>
             <w:pPr>
-              <w:spacing w:after="60"/>
-              <w:jc w:val="left"/>
-            </w:pPr>
-            <w:r>
-              <w:rPr>
-                <w:rFonts w:ascii="Times New Roman" w:hAnsi="Times New Roman"/>
-                <w:sz w:val="18"/>
-              </w:rPr>
-              <w:t>USD_TRY</w:t>
+              <w:jc w:val="center"/>
+            </w:pPr>
+            <w:r>
+              <w:rPr>
+                <w:rFonts w:ascii="Times New Roman" w:hAnsi="Times New Roman"/>
+                <w:sz w:val="18"/>
+              </w:rPr>
+              <w:t>EUR_TRY</w:t>
             </w:r>
           </w:p>
         </w:tc>
@@ -7908,15 +7833,14 @@
           </w:tcPr>
           <w:p>
             <w:pPr>
-              <w:spacing w:after="60"/>
-              <w:jc w:val="left"/>
-            </w:pPr>
-            <w:r>
-              <w:rPr>
-                <w:rFonts w:ascii="Times New Roman" w:hAnsi="Times New Roman"/>
-                <w:sz w:val="18"/>
-              </w:rPr>
-              <w:t>0.0833</w:t>
+              <w:jc w:val="center"/>
+            </w:pPr>
+            <w:r>
+              <w:rPr>
+                <w:rFonts w:ascii="Times New Roman" w:hAnsi="Times New Roman"/>
+                <w:sz w:val="18"/>
+              </w:rPr>
+              <w:t>0.0588</w:t>
             </w:r>
           </w:p>
         </w:tc>
@@ -7927,8 +7851,7 @@
           </w:tcPr>
           <w:p>
             <w:pPr>
-              <w:spacing w:after="60"/>
-              <w:jc w:val="left"/>
+              <w:jc w:val="center"/>
             </w:pPr>
             <w:r>
               <w:rPr>
@@ -7946,15 +7869,14 @@
           </w:tcPr>
           <w:p>
             <w:pPr>
-              <w:spacing w:after="60"/>
-              <w:jc w:val="left"/>
-            </w:pPr>
-            <w:r>
-              <w:rPr>
-                <w:rFonts w:ascii="Times New Roman" w:hAnsi="Times New Roman"/>
-                <w:sz w:val="18"/>
-              </w:rPr>
-              <w:t>0.0833</w:t>
+              <w:jc w:val="center"/>
+            </w:pPr>
+            <w:r>
+              <w:rPr>
+                <w:rFonts w:ascii="Times New Roman" w:hAnsi="Times New Roman"/>
+                <w:sz w:val="18"/>
+              </w:rPr>
+              <w:t>0.0588</w:t>
             </w:r>
           </w:p>
         </w:tc>
@@ -7965,8 +7887,7 @@
           </w:tcPr>
           <w:p>
             <w:pPr>
-              <w:spacing w:after="60"/>
-              <w:jc w:val="left"/>
+              <w:jc w:val="center"/>
             </w:pPr>
             <w:r>
               <w:rPr>
@@ -7984,8 +7905,7 @@
           </w:tcPr>
           <w:p>
             <w:pPr>
-              <w:spacing w:after="60"/>
-              <w:jc w:val="left"/>
+              <w:jc w:val="center"/>
             </w:pPr>
             <w:r>
               <w:rPr>
@@ -8008,15 +7928,14 @@
           </w:tcPr>
           <w:p>
             <w:pPr>
-              <w:spacing w:after="60"/>
-              <w:jc w:val="left"/>
-            </w:pPr>
-            <w:r>
-              <w:rPr>
-                <w:rFonts w:ascii="Times New Roman" w:hAnsi="Times New Roman"/>
-                <w:sz w:val="18"/>
-              </w:rPr>
-              <w:t>EUR_TRY</w:t>
+              <w:jc w:val="center"/>
+            </w:pPr>
+            <w:r>
+              <w:rPr>
+                <w:rFonts w:ascii="Times New Roman" w:hAnsi="Times New Roman"/>
+                <w:sz w:val="18"/>
+              </w:rPr>
+              <w:t>USD_TRY</w:t>
             </w:r>
           </w:p>
         </w:tc>
@@ -8027,15 +7946,14 @@
           </w:tcPr>
           <w:p>
             <w:pPr>
-              <w:spacing w:after="60"/>
-              <w:jc w:val="left"/>
-            </w:pPr>
-            <w:r>
-              <w:rPr>
-                <w:rFonts w:ascii="Times New Roman" w:hAnsi="Times New Roman"/>
-                <w:sz w:val="18"/>
-              </w:rPr>
-              <w:t>0.0833</w:t>
+              <w:jc w:val="center"/>
+            </w:pPr>
+            <w:r>
+              <w:rPr>
+                <w:rFonts w:ascii="Times New Roman" w:hAnsi="Times New Roman"/>
+                <w:sz w:val="18"/>
+              </w:rPr>
+              <w:t>0.0588</w:t>
             </w:r>
           </w:p>
         </w:tc>
@@ -8046,8 +7964,7 @@
           </w:tcPr>
           <w:p>
             <w:pPr>
-              <w:spacing w:after="60"/>
-              <w:jc w:val="left"/>
+              <w:jc w:val="center"/>
             </w:pPr>
             <w:r>
               <w:rPr>
@@ -8065,15 +7982,14 @@
           </w:tcPr>
           <w:p>
             <w:pPr>
-              <w:spacing w:after="60"/>
-              <w:jc w:val="left"/>
-            </w:pPr>
-            <w:r>
-              <w:rPr>
-                <w:rFonts w:ascii="Times New Roman" w:hAnsi="Times New Roman"/>
-                <w:sz w:val="18"/>
-              </w:rPr>
-              <w:t>0.0833</w:t>
+              <w:jc w:val="center"/>
+            </w:pPr>
+            <w:r>
+              <w:rPr>
+                <w:rFonts w:ascii="Times New Roman" w:hAnsi="Times New Roman"/>
+                <w:sz w:val="18"/>
+              </w:rPr>
+              <w:t>0.0588</w:t>
             </w:r>
           </w:p>
         </w:tc>
@@ -8084,8 +8000,7 @@
           </w:tcPr>
           <w:p>
             <w:pPr>
-              <w:spacing w:after="60"/>
-              <w:jc w:val="left"/>
+              <w:jc w:val="center"/>
             </w:pPr>
             <w:r>
               <w:rPr>
@@ -8103,8 +8018,7 @@
           </w:tcPr>
           <w:p>
             <w:pPr>
-              <w:spacing w:after="60"/>
-              <w:jc w:val="left"/>
+              <w:jc w:val="center"/>
             </w:pPr>
             <w:r>
               <w:rPr>

</xml_diff>